<commit_message>
docs: clarify Film 304 production bible
</commit_message>
<xml_diff>
--- a/Humber_FinalYear_Prep/Film304_Production_Bible_v01.docx
+++ b/Humber_FinalYear_Prep/Film304_Production_Bible_v01.docx
@@ -14,7 +14,7 @@
           <w:color w:val="C66A54"/>
           <w:sz w:val="18"/>
         </w:rPr>
-        <w:t>HUMBER FILM 304  /  CLASS REVIEW EDITION</w:t>
+        <w:t>FILM 304 CLASS REVIEW COPY</w:t>
       </w:r>
     </w:p>
     <w:p>
@@ -29,9 +29,9 @@
           <w:color w:val="24333F"/>
           <w:sz w:val="62"/>
         </w:rPr>
-        <w:t>Toon Materials</w:t>
+        <w:t>Humber Film 304</w:t>
         <w:br/>
-        <w:t>&amp; Character Handoff</w:t>
+        <w:t>Production Bible</w:t>
       </w:r>
     </w:p>
     <w:p>
@@ -46,7 +46,7 @@
           <w:color w:val="287F83"/>
           <w:sz w:val="30"/>
         </w:rPr>
-        <w:t>A production bible for the Humber Toon Spine project</w:t>
+        <w:t>Toon materials, asset names and Dana handoff</w:t>
       </w:r>
     </w:p>
     <w:p>
@@ -102,7 +102,7 @@
           <w:color w:val="61707A"/>
           <w:sz w:val="16"/>
         </w:rPr>
-        <w:t>Dana material and lighting preview. Static source pose; this image does not prove rig deformation.</w:t>
+        <w:t>Dana material and lighting preview. This static pose does not verify body or face deformation.</w:t>
       </w:r>
     </w:p>
     <w:p>
@@ -137,7 +137,7 @@
           <w:color w:val="C66A54"/>
           <w:sz w:val="16"/>
         </w:rPr>
-        <w:t>01 / START HERE</w:t>
+        <w:t>PROJECT SETUP</w:t>
       </w:r>
     </w:p>
     <w:p>
@@ -169,7 +169,7 @@
           <w:color w:val="24333F"/>
           <w:sz w:val="20"/>
         </w:rPr>
-        <w:t>This is a working guide to the Unreal toon materials, the film look, and the character handoff. It records what is built, what has been seen in a render, and what still needs a clean export.</w:t>
+        <w:t>This guide records the Humber Toon Spine material setup, the fixed deep-night sky preset, and Dana's current export status. Use it to find the right material, adjust its controls, follow asset names, and see what still needs a fresh render or rig export.</w:t>
       </w:r>
     </w:p>
     <w:tbl>
@@ -385,7 +385,7 @@
                 <w:color w:val="24333F"/>
                 <w:sz w:val="18"/>
               </w:rPr>
-              <w:t>1. Pick a family</w:t>
+              <w:t>1. Choose a family</w:t>
             </w:r>
           </w:p>
         </w:tc>
@@ -487,7 +487,7 @@
                 <w:color w:val="24333F"/>
                 <w:sz w:val="18"/>
               </w:rPr>
-              <w:t>2. Make a look</w:t>
+              <w:t>2. Set the surface</w:t>
             </w:r>
           </w:p>
         </w:tc>
@@ -590,7 +590,7 @@
                 <w:color w:val="24333F"/>
                 <w:sz w:val="18"/>
               </w:rPr>
-              <w:t>3. Set the bands</w:t>
+              <w:t>3. Set light bands</w:t>
             </w:r>
           </w:p>
         </w:tc>
@@ -726,7 +726,7 @@
                 <w:color w:val="24333F"/>
                 <w:sz w:val="18"/>
               </w:rPr>
-              <w:t>Check the look under the shot's actual light and grade.</w:t>
+              <w:t>Check the look under the shot's lighting and grade.</w:t>
             </w:r>
           </w:p>
         </w:tc>
@@ -760,7 +760,7 @@
                 <w:color w:val="24333F"/>
                 <w:sz w:val="18"/>
               </w:rPr>
-              <w:t>Saved still + review notes</w:t>
+              <w:t>Rendered still and notes</w:t>
             </w:r>
           </w:p>
         </w:tc>
@@ -802,7 +802,7 @@
           <w:color w:val="24333F"/>
           <w:sz w:val="20"/>
         </w:rPr>
-        <w:t>One person owns each Unreal binary while it is being edited. Material instances are the place for look variations.</w:t>
+        <w:t>Assign one person to each Unreal binary while it is open for editing. Put look changes in material instances.</w:t>
       </w:r>
     </w:p>
     <w:p>
@@ -819,7 +819,7 @@
           <w:color w:val="24333F"/>
           <w:sz w:val="20"/>
         </w:rPr>
-        <w:t>Keep changes in the builder that creates the asset. Record a still and the build report with the change.</w:t>
+        <w:t>Change the builder that makes an asset, rebuild it, and read back the result. Save a still and the build report.</w:t>
       </w:r>
     </w:p>
     <w:p>
@@ -836,7 +836,7 @@
           <w:color w:val="24333F"/>
           <w:sz w:val="20"/>
         </w:rPr>
-        <w:t>Use the SM6 workstation for final shader judgement. The Oct 8 laptop record says Substrate surfaces rendered black on that machine.</w:t>
+        <w:t>Use the SM6 workstation to judge final shader output. The Oct 8 laptop report records Substrate surfaces rendering black.</w:t>
       </w:r>
     </w:p>
     <w:tbl>
@@ -873,7 +873,7 @@
                 <w:color w:val="C66A54"/>
                 <w:sz w:val="20"/>
               </w:rPr>
-              <w:t>Status in one sentence</w:t>
+              <w:t>Open reviews</w:t>
             </w:r>
           </w:p>
           <w:p>
@@ -888,7 +888,7 @@
                 <w:color w:val="24333F"/>
                 <w:sz w:val="19"/>
               </w:rPr>
-              <w:t>The six film utilities and static deep-night preset have build and fresh-load compile records; visual approval of the sky and a final Dana deformation export remain open.</w:t>
+              <w:t>The six film functions and fixed night sky preset compiled after a fresh editor load on Oct 7. The sky still needs review in SH010 and SH020. Dana needs a new Maya export before body or face animation can be approved.</w:t>
             </w:r>
           </w:p>
         </w:tc>
@@ -916,7 +916,7 @@
           <w:color w:val="C66A54"/>
           <w:sz w:val="16"/>
         </w:rPr>
-        <w:t>02 / LOOK DEVELOPMENT</w:t>
+        <w:t>MATERIAL ASSIGNMENTS</w:t>
       </w:r>
     </w:p>
     <w:p>
@@ -933,7 +933,7 @@
           <w:color w:val="24333F"/>
           <w:sz w:val="44"/>
         </w:rPr>
-        <w:t>The material map</w:t>
+        <w:t>Material setup</w:t>
       </w:r>
     </w:p>
     <w:p>
@@ -948,7 +948,7 @@
           <w:color w:val="24333F"/>
           <w:sz w:val="20"/>
         </w:rPr>
-        <w:t>The spine keeps light response in a master, subject bands in a profile, and the visible variation in an instance. Outlines and the final film grade have their own place in the stack.</w:t>
+        <w:t>Use a master for the surface family, a toon profile for its light and shadow bands, and a material instance for color and surface detail. Apply outlines and the final film grade separately.</w:t>
       </w:r>
     </w:p>
     <w:tbl>
@@ -1445,7 +1445,7 @@
                 <w:color w:val="24333F"/>
                 <w:sz w:val="17"/>
               </w:rPr>
-              <w:t>DanaFilm eye instances</w:t>
+              <w:t>MI_DanaFilm_EyeWhite / MI_DanaFilm_Iris / MI_DanaFilm_EyeInterior / MI_DanaFilm_Cornea</w:t>
             </w:r>
           </w:p>
         </w:tc>
@@ -1479,7 +1479,7 @@
                 <w:color w:val="24333F"/>
                 <w:sz w:val="17"/>
               </w:rPr>
-              <w:t>Separate sclera, iris, eye interior, and cornea controls.</w:t>
+              <w:t>Separate controls for the sclera, iris, eye interior, and cornea.</w:t>
             </w:r>
           </w:p>
         </w:tc>
@@ -1785,7 +1785,7 @@
                 <w:color w:val="24333F"/>
                 <w:sz w:val="17"/>
               </w:rPr>
-              <w:t>One shared neutral grade, before per-shot tint.</w:t>
+              <w:t>Apply the shared grade before any shot-specific tint.</w:t>
             </w:r>
           </w:p>
         </w:tc>
@@ -1855,7 +1855,7 @@
                 <w:color w:val="24333F"/>
                 <w:sz w:val="17"/>
               </w:rPr>
-              <w:t>M_Outline_InvertedHull + MI_Outline_Thin/Heavy</w:t>
+              <w:t>M_Outline_InvertedHull + MI_Outline_Thin / MI_Outline_Heavy</w:t>
             </w:r>
           </w:p>
         </w:tc>
@@ -1889,7 +1889,7 @@
                 <w:color w:val="24333F"/>
                 <w:sz w:val="17"/>
               </w:rPr>
-              <w:t>Thin lines on characters; heavier lines on large architecture.</w:t>
+              <w:t>Use thin outlines on characters and heavier outlines on architecture.</w:t>
             </w:r>
           </w:p>
         </w:tc>
@@ -1914,7 +1914,7 @@
           <w:color w:val="287F83"/>
           <w:sz w:val="26"/>
         </w:rPr>
-        <w:t>Keep the image readable</w:t>
+        <w:t>Light and outline guidelines</w:t>
       </w:r>
     </w:p>
     <w:p>
@@ -1931,7 +1931,7 @@
           <w:color w:val="24333F"/>
           <w:sz w:val="20"/>
         </w:rPr>
-        <w:t>Keep the darkest toon band above pure black so shadowed shapes still read.</w:t>
+        <w:t>Keep the darkest profile band above pure black so shadowed forms retain their shape.</w:t>
       </w:r>
     </w:p>
     <w:p>
@@ -1948,7 +1948,7 @@
           <w:color w:val="24333F"/>
           <w:sz w:val="20"/>
         </w:rPr>
-        <w:t>Use the toon profile to shape the light bands; use the material instance for color and surface detail.</w:t>
+        <w:t>Set light and shadow bands in the toon profile. Set color and surface detail in the material instance.</w:t>
       </w:r>
     </w:p>
     <w:p>
@@ -1965,7 +1965,7 @@
           <w:color w:val="24333F"/>
           <w:sz w:val="20"/>
         </w:rPr>
-        <w:t>Keep one final grade in the post-composite material. Avoid stacking separate grades shot by shot.</w:t>
+        <w:t>Apply one final grade in the post-composite material. Add a shot tint only when the shot calls for it.</w:t>
       </w:r>
     </w:p>
     <w:p>
@@ -2041,7 +2041,7 @@
           <w:color w:val="C66A54"/>
           <w:sz w:val="16"/>
         </w:rPr>
-        <w:t>03 / REUSABLE CONTROLS</w:t>
+        <w:t>REUSABLE CONTROLS</w:t>
       </w:r>
     </w:p>
     <w:p>
@@ -2058,7 +2058,7 @@
           <w:color w:val="24333F"/>
           <w:sz w:val="44"/>
         </w:rPr>
-        <w:t>Six film tools and one sky preset</w:t>
+        <w:t>Film controls and deep-night sky</w:t>
       </w:r>
     </w:p>
     <w:p>
@@ -2073,7 +2073,7 @@
           <w:color w:val="24333F"/>
           <w:sz w:val="20"/>
         </w:rPr>
-        <w:t>Each utility is quiet at its default. Open a control only when the shot needs it, then judge the change in the final lighting.</w:t>
+        <w:t>These six functions start at neutral values. Raise a control when a shot needs the effect, then check it under the final lighting.</w:t>
       </w:r>
     </w:p>
     <w:tbl>
@@ -2194,7 +2194,7 @@
                 <w:color w:val="FFFFFF"/>
                 <w:sz w:val="16"/>
               </w:rPr>
-              <w:t>Artist controls and safe start</w:t>
+              <w:t>Controls and starting values</w:t>
             </w:r>
           </w:p>
         </w:tc>
@@ -2500,7 +2500,7 @@
                 <w:color w:val="24333F"/>
                 <w:sz w:val="16"/>
               </w:rPr>
-              <w:t>DFContactStrength 0. Tint and roughness stay unchanged until strength is raised.</w:t>
+              <w:t>DFContactStrength 0. Raise it to add contact dirt; tint and roughness stay unchanged at zero.</w:t>
             </w:r>
           </w:p>
         </w:tc>
@@ -2809,7 +2809,7 @@
                 <w:color w:val="24333F"/>
                 <w:sz w:val="16"/>
               </w:rPr>
-              <w:t>Contrast 1, Warmth 0, Saturation 1, Lift 0. GradeTint remains the shot tint.</w:t>
+              <w:t>Contrast 1; Warmth 0; Saturation 1; Lift 0. Keep GradeTint at the shot tint.</w:t>
             </w:r>
           </w:p>
         </w:tc>
@@ -2854,7 +2854,7 @@
                 <w:color w:val="287F83"/>
                 <w:sz w:val="20"/>
               </w:rPr>
-              <w:t>Deep-night sky</w:t>
+              <w:t>Deep-night preset</w:t>
             </w:r>
           </w:p>
           <w:p>
@@ -2869,7 +2869,7 @@
                 <w:color w:val="24333F"/>
                 <w:sz w:val="19"/>
               </w:rPr>
-              <w:t>MI_Toon_Sky_DeepNight sits on M_Master_Toon_Sky. It uses an indigo-black zenith, a city-glow horizon, four value bands, and sparse stars. It is a fixed preset; there is no time-of-day control.</w:t>
+              <w:t>MI_Toon_Sky_DeepNight is an instance of M_Master_Toon_Sky. It has an indigo-black zenith, a city-glow horizon, four value bands, and sparse stars. The preset is fixed and has no time-of-day controls.</w:t>
             </w:r>
           </w:p>
         </w:tc>
@@ -2892,7 +2892,7 @@
           <w:color w:val="61707A"/>
           <w:sz w:val="19"/>
         </w:rPr>
-        <w:t>Keep iridescence, sparkle, vein glow, and radial rings out of this film set. Add a new function only when a shot has a named, visible need for it.</w:t>
+        <w:t>Leave iridescence, sparkle, vein glow, and radial rings out of the film materials. Add another function only when a shot needs a specific effect.</w:t>
       </w:r>
     </w:p>
     <w:p>
@@ -2912,7 +2912,7 @@
           <w:color w:val="C66A54"/>
           <w:sz w:val="16"/>
         </w:rPr>
-        <w:t>04 / FILES AND HANDOFF</w:t>
+        <w:t>FILE AND NAMING RULES</w:t>
       </w:r>
     </w:p>
     <w:p>
@@ -2929,7 +2929,7 @@
           <w:color w:val="24333F"/>
           <w:sz w:val="44"/>
         </w:rPr>
-        <w:t>Names that travel</w:t>
+        <w:t>Asset names and handoff</w:t>
       </w:r>
     </w:p>
     <w:p>
@@ -2944,7 +2944,7 @@
           <w:color w:val="24333F"/>
           <w:sz w:val="20"/>
         </w:rPr>
-        <w:t>Inside Unreal, use the prefixes in Docs/CONTENT_CONVENTIONS.md. In the Humber staging folders, use the role prefixes from GROUP_STAGING_GUIDE.md. The staging name describes the incoming file; the Unreal name describes the asset people will use.</w:t>
+        <w:t>Inside Unreal, use the prefixes in Docs/CONTENT_CONVENTIONS.md. Use role prefixes only in the Humber staging folders. A staging prefix identifies the incoming source file; an Unreal prefix identifies the asset in the project.</w:t>
       </w:r>
     </w:p>
     <w:tbl>
@@ -4364,7 +4364,7 @@
           <w:color w:val="24333F"/>
           <w:sz w:val="20"/>
         </w:rPr>
-        <w:t>For imported textures, use _D for diffuse, _N for normal, _R for roughness, and _M for masks.</w:t>
+        <w:t>For textures, use _D for diffuse, _N for normal, _R for roughness, and _M for masks.</w:t>
       </w:r>
     </w:p>
     <w:p>
@@ -4381,7 +4381,7 @@
           <w:color w:val="24333F"/>
           <w:sz w:val="20"/>
         </w:rPr>
-        <w:t>Use a word for a real variant, such as _Thin or _Heavy. Do not make Stone2 or final_final.</w:t>
+        <w:t>Use a descriptive word for a real variant, such as _Thin or _Heavy. Avoid names like Stone2 and final_final.</w:t>
       </w:r>
     </w:p>
     <w:p>
@@ -4398,7 +4398,7 @@
           <w:color w:val="24333F"/>
           <w:sz w:val="20"/>
         </w:rPr>
-        <w:t>The staging guide uses _v01 for versioned source drops. Keep Unreal asset names stable and meaningful.</w:t>
+        <w:t>The staging guide uses _v01 for versioned source files. Keep Unreal asset names stable once other files reference them.</w:t>
       </w:r>
     </w:p>
     <w:p>
@@ -4415,7 +4415,7 @@
           <w:color w:val="24333F"/>
           <w:sz w:val="20"/>
         </w:rPr>
-        <w:t>The local UE naming guide does not set a SkeletalMesh prefix. Agree that prefix with the group before the final Dana import.</w:t>
+        <w:t>The UE naming guide does not specify a SkeletalMesh prefix. Agree on one with the group before Dana's final import.</w:t>
       </w:r>
     </w:p>
     <w:tbl>
@@ -4452,7 +4452,7 @@
                 <w:color w:val="287F83"/>
                 <w:sz w:val="20"/>
               </w:rPr>
-              <w:t>Before importing</w:t>
+              <w:t>Before import</w:t>
             </w:r>
           </w:p>
           <w:p>
@@ -4467,7 +4467,7 @@
                 <w:color w:val="24333F"/>
                 <w:sz w:val="19"/>
               </w:rPr>
-              <w:t>Confirm the file owner, source path, units, up axis, material slots, skin weights, and intended Unreal name. Keep the source FBX beside its import notes.</w:t>
+              <w:t>Confirm the owner, source path, units, up axis, material slots, and skin weights. Record the intended Unreal name and keep the source FBX beside its import notes.</w:t>
             </w:r>
           </w:p>
         </w:tc>
@@ -4495,7 +4495,7 @@
           <w:color w:val="C66A54"/>
           <w:sz w:val="16"/>
         </w:rPr>
-        <w:t>05 / CHARACTER HANDOFF</w:t>
+        <w:t>DANA HANDOFF</w:t>
       </w:r>
     </w:p>
     <w:p>
@@ -4512,7 +4512,7 @@
           <w:color w:val="24333F"/>
           <w:sz w:val="44"/>
         </w:rPr>
-        <w:t>Dana: what the preview proves</w:t>
+        <w:t>Dana rig and lash findings</w:t>
       </w:r>
     </w:p>
     <w:p>
@@ -4568,7 +4568,7 @@
           <w:color w:val="61707A"/>
           <w:sz w:val="16"/>
         </w:rPr>
-        <w:t>Current daylight preview. It is a static pose and the upper lash line is not reading in this image.</w:t>
+        <w:t>Daylight preview. This is a static pose; the upper lash line is faint, and the image does not verify body or face deformation.</w:t>
       </w:r>
     </w:p>
     <w:tbl>
@@ -4618,7 +4618,7 @@
                 <w:color w:val="FFFFFF"/>
                 <w:sz w:val="17"/>
               </w:rPr>
-              <w:t>Readback</w:t>
+              <w:t>Area</w:t>
             </w:r>
           </w:p>
         </w:tc>
@@ -4653,7 +4653,7 @@
                 <w:color w:val="FFFFFF"/>
                 <w:sz w:val="17"/>
               </w:rPr>
-              <w:t>Current finding</w:t>
+              <w:t>Audit result</w:t>
             </w:r>
           </w:p>
         </w:tc>
@@ -4721,7 +4721,7 @@
                 <w:color w:val="24333F"/>
                 <w:sz w:val="17"/>
               </w:rPr>
-              <w:t>The DanaFilm preview has one Dana actor and 11 assigned material slots in the build record.</w:t>
+              <w:t>The preview build has one Dana actor and 11 assigned material slots.</w:t>
             </w:r>
           </w:p>
         </w:tc>
@@ -4791,7 +4791,7 @@
                 <w:color w:val="24333F"/>
                 <w:sz w:val="17"/>
               </w:rPr>
-              <w:t>The source FBX body has zero skin clusters. The still does not prove a working body or face rig.</w:t>
+              <w:t>The source FBX body has no skin cluster, so this export cannot prove body deformation.</w:t>
             </w:r>
           </w:p>
         </w:tc>
@@ -4859,7 +4859,7 @@
                 <w:color w:val="24333F"/>
                 <w:sz w:val="17"/>
               </w:rPr>
-              <w:t>39 vertices and 48 triangles per side; all vertices weighted to FaceUpperRegion_M.</w:t>
+              <w:t>Each side has 39 vertices and 48 triangles. All lash vertices are weighted to FaceUpperRegion_M.</w:t>
             </w:r>
           </w:p>
         </w:tc>
@@ -4929,7 +4929,7 @@
                 <w:color w:val="24333F"/>
                 <w:sz w:val="17"/>
               </w:rPr>
-              <w:t>Both intended lash transforms and their FaceDeformationSystem parent are exported hidden.</w:t>
+              <w:t>The intended lash meshes and their FaceDeformationSystem parent are hidden in the export.</w:t>
             </w:r>
           </w:p>
         </w:tc>
@@ -4964,7 +4964,7 @@
                 <w:color w:val="24333F"/>
                 <w:sz w:val="17"/>
               </w:rPr>
-              <w:t>Alternate squint pair</w:t>
+              <w:t>Squint meshes</w:t>
             </w:r>
           </w:p>
         </w:tc>
@@ -4997,7 +4997,7 @@
                 <w:color w:val="24333F"/>
                 <w:sz w:val="17"/>
               </w:rPr>
-              <w:t>The two squint meshes have no skin weights. Keep them out of the render export.</w:t>
+              <w:t>The alternate squint pair has no skin weights. Exclude it from the render export.</w:t>
             </w:r>
           </w:p>
         </w:tc>
@@ -5067,7 +5067,7 @@
                 <w:color w:val="24333F"/>
                 <w:sz w:val="17"/>
               </w:rPr>
-              <w:t>The lash geometry uses danaHair_mat. The slot is mapped to the hair instance; the missing lash line is not a shader assignment fault.</w:t>
+              <w:t>The lashes use danaHair_mat, which maps to the hair instance. The missing lash line is not a material assignment problem.</w:t>
             </w:r>
           </w:p>
         </w:tc>
@@ -5112,7 +5112,7 @@
                 <w:color w:val="C66A54"/>
                 <w:sz w:val="20"/>
               </w:rPr>
-              <w:t>Next source export</w:t>
+              <w:t>Maya export still needed</w:t>
             </w:r>
           </w:p>
           <w:p>
@@ -5127,7 +5127,7 @@
                 <w:color w:val="24333F"/>
                 <w:sz w:val="19"/>
               </w:rPr>
-              <w:t>In Maya, unhide the intended upper/lower pair, repair the face/head export hierarchy so its influence bones belong to the same exported skeleton as the body, and add the body skinCluster. Then test blink, close, look-up, and squint before replacing the Unreal preview.</w:t>
+              <w:t>Turn on the intended upper/lower lash pair. Export the body with skin weights and include the face/head bones on the same skeleton as the body. Keep the lash weights on FaceUpperRegion_M. Test blink, closed eyes, look-up, and squint before replacing the Unreal preview.</w:t>
             </w:r>
           </w:p>
         </w:tc>
@@ -5150,7 +5150,7 @@
           <w:color w:val="61707A"/>
           <w:sz w:val="18"/>
         </w:rPr>
-        <w:t>A filtered FBX preview preserved the lashes, but the body still had no skin cluster. That file is useful for diagnosis, not as the production rig export.</w:t>
+        <w:t>The filtered FBX kept the lashes but still had no body skin cluster. Use it for diagnosis only; it is not a production rig export.</w:t>
       </w:r>
     </w:p>
     <w:p>
@@ -5170,7 +5170,7 @@
           <w:color w:val="C66A54"/>
           <w:sz w:val="16"/>
         </w:rPr>
-        <w:t>06 / SHOT-FACING NOTES</w:t>
+        <w:t>OFFICE SPIDER SHOT PLAN</w:t>
       </w:r>
     </w:p>
     <w:p>
@@ -5187,7 +5187,7 @@
           <w:color w:val="24333F"/>
           <w:sz w:val="44"/>
         </w:rPr>
-        <w:t>Materials by part of the film</w:t>
+        <w:t>Materials by shot range</w:t>
       </w:r>
     </w:p>
     <w:p>
@@ -5202,7 +5202,7 @@
           <w:color w:val="24333F"/>
           <w:sz w:val="20"/>
         </w:rPr>
-        <w:t>These are material references from the Office Spider shot plan. Use the storyboard and the current shot owner to confirm any change before promoting a look.</w:t>
+        <w:t>This table follows the Office Spider shot plan. Check the storyboard and confirm changes with the shot owner before changing a material look.</w:t>
       </w:r>
     </w:p>
     <w:tbl>
@@ -5654,7 +5654,7 @@
           <w:color w:val="287F83"/>
           <w:sz w:val="26"/>
         </w:rPr>
-        <w:t>Examples from the prop shelf</w:t>
+        <w:t>Prop materials</w:t>
       </w:r>
     </w:p>
     <w:p>
@@ -5742,7 +5742,7 @@
                 <w:color w:val="287F83"/>
                 <w:sz w:val="20"/>
               </w:rPr>
-              <w:t>A material check is visual</w:t>
+              <w:t>Review materials in the shot</w:t>
             </w:r>
           </w:p>
           <w:p>
@@ -5757,7 +5757,7 @@
                 <w:color w:val="24333F"/>
                 <w:sz w:val="19"/>
               </w:rPr>
-              <w:t>A green build report says the graph loaded and the parameters exist. It does not tell us whether the band, outline, shadow, or texture reads well in the shot.</w:t>
+              <w:t>A green build report confirms the graph loaded and its parameters exist. The lighting, bands, outlines, and textures still need visual review in the shot.</w:t>
             </w:r>
           </w:p>
         </w:tc>
@@ -5785,7 +5785,7 @@
           <w:color w:val="C66A54"/>
           <w:sz w:val="16"/>
         </w:rPr>
-        <w:t>07 / GATES AND NEXT STEPS</w:t>
+        <w:t>REVIEW</w:t>
       </w:r>
     </w:p>
     <w:p>
@@ -5802,7 +5802,7 @@
           <w:color w:val="24333F"/>
           <w:sz w:val="44"/>
         </w:rPr>
-        <w:t>Review before calling it done</w:t>
+        <w:t>Checks still to complete</w:t>
       </w:r>
     </w:p>
     <w:tbl>
@@ -6358,7 +6358,7 @@
           <w:color w:val="287F83"/>
           <w:sz w:val="26"/>
         </w:rPr>
-        <w:t>Next four actions</w:t>
+        <w:t>Next steps</w:t>
       </w:r>
     </w:p>
     <w:p>
@@ -6443,7 +6443,7 @@
           <w:color w:val="287F83"/>
           <w:sz w:val="26"/>
         </w:rPr>
-        <w:t>Records used</w:t>
+        <w:t>Sources and records</w:t>
       </w:r>
     </w:p>
     <w:p>
@@ -6488,7 +6488,7 @@
         <w:color w:val="61707A"/>
         <w:sz w:val="16"/>
       </w:rPr>
-      <w:t xml:space="preserve">FILM 304  /  HUMBERTON TOON SPINE     </w:t>
+      <w:t xml:space="preserve">HUMBER FILM 304     </w:t>
     </w:r>
     <w:r>
       <w:rPr>
@@ -6520,7 +6520,7 @@
         <w:color w:val="287F83"/>
         <w:sz w:val="16"/>
       </w:rPr>
-      <w:t>HUMBER 304     /     MATERIALS AND CHARACTER HANDOFF</w:t>
+      <w:t>HUMBER FILM 304     |     MATERIALS AND CHARACTER HANDOFF</w:t>
     </w:r>
   </w:p>
 </w:hdr>

</xml_diff>

<commit_message>
docs: add full team staging names to Film 304 bible
</commit_message>
<xml_diff>
--- a/Humber_FinalYear_Prep/Film304_Production_Bible_v01.docx
+++ b/Humber_FinalYear_Prep/Film304_Production_Bible_v01.docx
@@ -19,6 +19,7 @@
     </w:p>
     <w:p>
       <w:pPr>
+        <w:pStyle w:val="Title"/>
         <w:spacing w:after="120"/>
       </w:pPr>
       <w:r>
@@ -3898,460 +3899,6 @@
     </w:p>
     <w:p>
       <w:pPr>
-        <w:pStyle w:val="Heading2"/>
-        <w:keepNext/>
-        <w:spacing w:before="120" w:after="60"/>
-      </w:pPr>
-      <w:r>
-        <w:rPr>
-          <w:rFonts w:ascii="Aptos" w:hAnsi="Aptos"/>
-          <w:b/>
-          <w:i w:val="0"/>
-          <w:color w:val="287F83"/>
-          <w:sz w:val="26"/>
-        </w:rPr>
-        <w:t>Staging folder examples</w:t>
-      </w:r>
-    </w:p>
-    <w:tbl>
-      <w:tblPr>
-        <w:tblStyle w:val="TableGrid"/>
-        <w:tblW w:type="auto" w:w="0"/>
-        <w:jc w:val="center"/>
-        <w:tblLayout w:type="fixed"/>
-        <w:tblLook w:firstColumn="1" w:firstRow="1" w:lastColumn="0" w:lastRow="0" w:noHBand="0" w:noVBand="1" w:val="04A0"/>
-      </w:tblPr>
-      <w:tblGrid>
-        <w:gridCol w:w="5083"/>
-        <w:gridCol w:w="5083"/>
-      </w:tblGrid>
-      <w:tr>
-        <w:trPr>
-          <w:tblHeader w:val="true"/>
-        </w:trPr>
-        <w:tc>
-          <w:tcPr>
-            <w:tcW w:type="dxa" w:w="2952"/>
-            <w:vAlign w:val="center"/>
-            <w:tcMar>
-              <w:top w:w="90" w:type="dxa"/>
-              <w:start w:w="110" w:type="dxa"/>
-              <w:bottom w:w="90" w:type="dxa"/>
-              <w:end w:w="110" w:type="dxa"/>
-            </w:tcMar>
-            <w:shd w:fill="24333F"/>
-          </w:tcPr>
-          <w:p>
-            <w:pPr>
-              <w:spacing w:after="0" w:line="252" w:lineRule="auto"/>
-            </w:pPr>
-            <w:r>
-              <w:rPr>
-                <w:rFonts w:ascii="Aptos" w:hAnsi="Aptos"/>
-                <w:b/>
-                <w:color w:val="FFFFFF"/>
-                <w:sz w:val="18"/>
-              </w:rPr>
-            </w:r>
-            <w:r>
-              <w:rPr>
-                <w:rFonts w:ascii="Aptos" w:hAnsi="Aptos"/>
-                <w:b/>
-                <w:color w:val="FFFFFF"/>
-                <w:sz w:val="18"/>
-              </w:rPr>
-              <w:t>Incoming work</w:t>
-            </w:r>
-          </w:p>
-        </w:tc>
-        <w:tc>
-          <w:tcPr>
-            <w:tcW w:type="dxa" w:w="6912"/>
-            <w:vAlign w:val="center"/>
-            <w:tcMar>
-              <w:top w:w="90" w:type="dxa"/>
-              <w:start w:w="110" w:type="dxa"/>
-              <w:bottom w:w="90" w:type="dxa"/>
-              <w:end w:w="110" w:type="dxa"/>
-            </w:tcMar>
-            <w:shd w:fill="24333F"/>
-          </w:tcPr>
-          <w:p>
-            <w:pPr>
-              <w:spacing w:after="0" w:line="252" w:lineRule="auto"/>
-            </w:pPr>
-            <w:r>
-              <w:rPr>
-                <w:rFonts w:ascii="Aptos" w:hAnsi="Aptos"/>
-                <w:b/>
-                <w:color w:val="FFFFFF"/>
-                <w:sz w:val="18"/>
-              </w:rPr>
-            </w:r>
-            <w:r>
-              <w:rPr>
-                <w:rFonts w:ascii="Aptos" w:hAnsi="Aptos"/>
-                <w:b/>
-                <w:color w:val="FFFFFF"/>
-                <w:sz w:val="18"/>
-              </w:rPr>
-              <w:t>Folder and prefix</w:t>
-            </w:r>
-          </w:p>
-        </w:tc>
-      </w:tr>
-      <w:tr>
-        <w:tc>
-          <w:tcPr>
-            <w:tcW w:type="dxa" w:w="2952"/>
-            <w:vAlign w:val="center"/>
-            <w:tcMar>
-              <w:top w:w="90" w:type="dxa"/>
-              <w:start w:w="110" w:type="dxa"/>
-              <w:bottom w:w="90" w:type="dxa"/>
-              <w:end w:w="110" w:type="dxa"/>
-            </w:tcMar>
-          </w:tcPr>
-          <w:p>
-            <w:pPr>
-              <w:spacing w:after="0" w:line="250" w:lineRule="auto"/>
-            </w:pPr>
-            <w:r>
-              <w:rPr>
-                <w:rFonts w:ascii="Aptos" w:hAnsi="Aptos"/>
-                <w:color w:val="24333F"/>
-                <w:sz w:val="18"/>
-              </w:rPr>
-            </w:r>
-            <w:r>
-              <w:rPr>
-                <w:rFonts w:ascii="Aptos" w:hAnsi="Aptos"/>
-                <w:b w:val="0"/>
-                <w:color w:val="24333F"/>
-                <w:sz w:val="18"/>
-              </w:rPr>
-              <w:t>Character model</w:t>
-            </w:r>
-          </w:p>
-        </w:tc>
-        <w:tc>
-          <w:tcPr>
-            <w:tcW w:type="dxa" w:w="6912"/>
-            <w:vAlign w:val="center"/>
-            <w:tcMar>
-              <w:top w:w="90" w:type="dxa"/>
-              <w:start w:w="110" w:type="dxa"/>
-              <w:bottom w:w="90" w:type="dxa"/>
-              <w:end w:w="110" w:type="dxa"/>
-            </w:tcMar>
-          </w:tcPr>
-          <w:p>
-            <w:pPr>
-              <w:spacing w:after="0" w:line="250" w:lineRule="auto"/>
-            </w:pPr>
-            <w:r>
-              <w:rPr>
-                <w:rFonts w:ascii="Aptos" w:hAnsi="Aptos"/>
-                <w:color w:val="24333F"/>
-                <w:sz w:val="18"/>
-              </w:rPr>
-            </w:r>
-            <w:r>
-              <w:rPr>
-                <w:rFonts w:ascii="Aptos" w:hAnsi="Aptos"/>
-                <w:b w:val="0"/>
-                <w:color w:val="24333F"/>
-                <w:sz w:val="18"/>
-              </w:rPr>
-              <w:t>02_Assets/Models/Characters/CH_*</w:t>
-            </w:r>
-          </w:p>
-        </w:tc>
-      </w:tr>
-      <w:tr>
-        <w:tc>
-          <w:tcPr>
-            <w:tcW w:type="dxa" w:w="2952"/>
-            <w:vAlign w:val="center"/>
-            <w:tcMar>
-              <w:top w:w="90" w:type="dxa"/>
-              <w:start w:w="110" w:type="dxa"/>
-              <w:bottom w:w="90" w:type="dxa"/>
-              <w:end w:w="110" w:type="dxa"/>
-            </w:tcMar>
-            <w:shd w:fill="F0F4F2"/>
-          </w:tcPr>
-          <w:p>
-            <w:pPr>
-              <w:spacing w:after="0" w:line="250" w:lineRule="auto"/>
-            </w:pPr>
-            <w:r>
-              <w:rPr>
-                <w:rFonts w:ascii="Aptos" w:hAnsi="Aptos"/>
-                <w:color w:val="24333F"/>
-                <w:sz w:val="18"/>
-              </w:rPr>
-            </w:r>
-            <w:r>
-              <w:rPr>
-                <w:rFonts w:ascii="Aptos" w:hAnsi="Aptos"/>
-                <w:b w:val="0"/>
-                <w:color w:val="24333F"/>
-                <w:sz w:val="18"/>
-              </w:rPr>
-              <w:t>Character rig</w:t>
-            </w:r>
-          </w:p>
-        </w:tc>
-        <w:tc>
-          <w:tcPr>
-            <w:tcW w:type="dxa" w:w="6912"/>
-            <w:vAlign w:val="center"/>
-            <w:tcMar>
-              <w:top w:w="90" w:type="dxa"/>
-              <w:start w:w="110" w:type="dxa"/>
-              <w:bottom w:w="90" w:type="dxa"/>
-              <w:end w:w="110" w:type="dxa"/>
-            </w:tcMar>
-            <w:shd w:fill="F0F4F2"/>
-          </w:tcPr>
-          <w:p>
-            <w:pPr>
-              <w:spacing w:after="0" w:line="250" w:lineRule="auto"/>
-            </w:pPr>
-            <w:r>
-              <w:rPr>
-                <w:rFonts w:ascii="Aptos" w:hAnsi="Aptos"/>
-                <w:color w:val="24333F"/>
-                <w:sz w:val="18"/>
-              </w:rPr>
-            </w:r>
-            <w:r>
-              <w:rPr>
-                <w:rFonts w:ascii="Aptos" w:hAnsi="Aptos"/>
-                <w:b w:val="0"/>
-                <w:color w:val="24333F"/>
-                <w:sz w:val="18"/>
-              </w:rPr>
-              <w:t>02_Assets/Rigs/Character/RIG_CH_*</w:t>
-            </w:r>
-          </w:p>
-        </w:tc>
-      </w:tr>
-      <w:tr>
-        <w:tc>
-          <w:tcPr>
-            <w:tcW w:type="dxa" w:w="2952"/>
-            <w:vAlign w:val="center"/>
-            <w:tcMar>
-              <w:top w:w="90" w:type="dxa"/>
-              <w:start w:w="110" w:type="dxa"/>
-              <w:bottom w:w="90" w:type="dxa"/>
-              <w:end w:w="110" w:type="dxa"/>
-            </w:tcMar>
-          </w:tcPr>
-          <w:p>
-            <w:pPr>
-              <w:spacing w:after="0" w:line="250" w:lineRule="auto"/>
-            </w:pPr>
-            <w:r>
-              <w:rPr>
-                <w:rFonts w:ascii="Aptos" w:hAnsi="Aptos"/>
-                <w:color w:val="24333F"/>
-                <w:sz w:val="18"/>
-              </w:rPr>
-            </w:r>
-            <w:r>
-              <w:rPr>
-                <w:rFonts w:ascii="Aptos" w:hAnsi="Aptos"/>
-                <w:b w:val="0"/>
-                <w:color w:val="24333F"/>
-                <w:sz w:val="18"/>
-              </w:rPr>
-              <w:t>Environment model</w:t>
-            </w:r>
-          </w:p>
-        </w:tc>
-        <w:tc>
-          <w:tcPr>
-            <w:tcW w:type="dxa" w:w="6912"/>
-            <w:vAlign w:val="center"/>
-            <w:tcMar>
-              <w:top w:w="90" w:type="dxa"/>
-              <w:start w:w="110" w:type="dxa"/>
-              <w:bottom w:w="90" w:type="dxa"/>
-              <w:end w:w="110" w:type="dxa"/>
-            </w:tcMar>
-          </w:tcPr>
-          <w:p>
-            <w:pPr>
-              <w:spacing w:after="0" w:line="250" w:lineRule="auto"/>
-            </w:pPr>
-            <w:r>
-              <w:rPr>
-                <w:rFonts w:ascii="Aptos" w:hAnsi="Aptos"/>
-                <w:color w:val="24333F"/>
-                <w:sz w:val="18"/>
-              </w:rPr>
-            </w:r>
-            <w:r>
-              <w:rPr>
-                <w:rFonts w:ascii="Aptos" w:hAnsi="Aptos"/>
-                <w:b w:val="0"/>
-                <w:color w:val="24333F"/>
-                <w:sz w:val="18"/>
-              </w:rPr>
-              <w:t>02_Assets/Models/Environments/EN_*</w:t>
-            </w:r>
-          </w:p>
-        </w:tc>
-      </w:tr>
-      <w:tr>
-        <w:tc>
-          <w:tcPr>
-            <w:tcW w:type="dxa" w:w="2952"/>
-            <w:vAlign w:val="center"/>
-            <w:tcMar>
-              <w:top w:w="90" w:type="dxa"/>
-              <w:start w:w="110" w:type="dxa"/>
-              <w:bottom w:w="90" w:type="dxa"/>
-              <w:end w:w="110" w:type="dxa"/>
-            </w:tcMar>
-            <w:shd w:fill="F0F4F2"/>
-          </w:tcPr>
-          <w:p>
-            <w:pPr>
-              <w:spacing w:after="0" w:line="250" w:lineRule="auto"/>
-            </w:pPr>
-            <w:r>
-              <w:rPr>
-                <w:rFonts w:ascii="Aptos" w:hAnsi="Aptos"/>
-                <w:color w:val="24333F"/>
-                <w:sz w:val="18"/>
-              </w:rPr>
-            </w:r>
-            <w:r>
-              <w:rPr>
-                <w:rFonts w:ascii="Aptos" w:hAnsi="Aptos"/>
-                <w:b w:val="0"/>
-                <w:color w:val="24333F"/>
-                <w:sz w:val="18"/>
-              </w:rPr>
-              <w:t>Prop model</w:t>
-            </w:r>
-          </w:p>
-        </w:tc>
-        <w:tc>
-          <w:tcPr>
-            <w:tcW w:type="dxa" w:w="6912"/>
-            <w:vAlign w:val="center"/>
-            <w:tcMar>
-              <w:top w:w="90" w:type="dxa"/>
-              <w:start w:w="110" w:type="dxa"/>
-              <w:bottom w:w="90" w:type="dxa"/>
-              <w:end w:w="110" w:type="dxa"/>
-            </w:tcMar>
-            <w:shd w:fill="F0F4F2"/>
-          </w:tcPr>
-          <w:p>
-            <w:pPr>
-              <w:spacing w:after="0" w:line="250" w:lineRule="auto"/>
-            </w:pPr>
-            <w:r>
-              <w:rPr>
-                <w:rFonts w:ascii="Aptos" w:hAnsi="Aptos"/>
-                <w:color w:val="24333F"/>
-                <w:sz w:val="18"/>
-              </w:rPr>
-            </w:r>
-            <w:r>
-              <w:rPr>
-                <w:rFonts w:ascii="Aptos" w:hAnsi="Aptos"/>
-                <w:b w:val="0"/>
-                <w:color w:val="24333F"/>
-                <w:sz w:val="18"/>
-              </w:rPr>
-              <w:t>02_Assets/Models/Props/PR_*</w:t>
-            </w:r>
-          </w:p>
-        </w:tc>
-      </w:tr>
-      <w:tr>
-        <w:tc>
-          <w:tcPr>
-            <w:tcW w:type="dxa" w:w="2952"/>
-            <w:vAlign w:val="center"/>
-            <w:tcMar>
-              <w:top w:w="90" w:type="dxa"/>
-              <w:start w:w="110" w:type="dxa"/>
-              <w:bottom w:w="90" w:type="dxa"/>
-              <w:end w:w="110" w:type="dxa"/>
-            </w:tcMar>
-          </w:tcPr>
-          <w:p>
-            <w:pPr>
-              <w:spacing w:after="0" w:line="250" w:lineRule="auto"/>
-            </w:pPr>
-            <w:r>
-              <w:rPr>
-                <w:rFonts w:ascii="Aptos" w:hAnsi="Aptos"/>
-                <w:color w:val="24333F"/>
-                <w:sz w:val="18"/>
-              </w:rPr>
-            </w:r>
-            <w:r>
-              <w:rPr>
-                <w:rFonts w:ascii="Aptos" w:hAnsi="Aptos"/>
-                <w:b w:val="0"/>
-                <w:color w:val="24333F"/>
-                <w:sz w:val="18"/>
-              </w:rPr>
-              <w:t>Material work</w:t>
-            </w:r>
-          </w:p>
-        </w:tc>
-        <w:tc>
-          <w:tcPr>
-            <w:tcW w:type="dxa" w:w="6912"/>
-            <w:vAlign w:val="center"/>
-            <w:tcMar>
-              <w:top w:w="90" w:type="dxa"/>
-              <w:start w:w="110" w:type="dxa"/>
-              <w:bottom w:w="90" w:type="dxa"/>
-              <w:end w:w="110" w:type="dxa"/>
-            </w:tcMar>
-          </w:tcPr>
-          <w:p>
-            <w:pPr>
-              <w:spacing w:after="0" w:line="250" w:lineRule="auto"/>
-            </w:pPr>
-            <w:r>
-              <w:rPr>
-                <w:rFonts w:ascii="Aptos" w:hAnsi="Aptos"/>
-                <w:color w:val="24333F"/>
-                <w:sz w:val="18"/>
-              </w:rPr>
-            </w:r>
-            <w:r>
-              <w:rPr>
-                <w:rFonts w:ascii="Aptos" w:hAnsi="Aptos"/>
-                <w:b w:val="0"/>
-                <w:color w:val="24333F"/>
-                <w:sz w:val="18"/>
-              </w:rPr>
-              <w:t>02_Assets/Materials/M_*, MI_*, TP_*, T_*</w:t>
-            </w:r>
-          </w:p>
-        </w:tc>
-      </w:tr>
-    </w:tbl>
-    <w:p>
-      <w:pPr>
-        <w:spacing w:after="0"/>
-      </w:pPr>
-    </w:p>
-    <w:p>
-      <w:pPr>
         <w:pStyle w:val="ListBullet"/>
         <w:spacing w:after="60" w:line="250" w:lineRule="auto"/>
         <w:ind w:left="317" w:hanging="187"/>
@@ -4398,7 +3945,7 @@
           <w:color w:val="24333F"/>
           <w:sz w:val="20"/>
         </w:rPr>
-        <w:t>The staging guide uses _v01 for versioned source files. Keep Unreal asset names stable once other files reference them.</w:t>
+        <w:t>For source-drop prefixes and version numbers, use the team staging table on the next page.</w:t>
       </w:r>
     </w:p>
     <w:p>
@@ -4477,6 +4024,1697 @@
       <w:pPr>
         <w:spacing w:after="0"/>
       </w:pPr>
+    </w:p>
+    <w:p>
+      <w:r>
+        <w:br w:type="page"/>
+      </w:r>
+    </w:p>
+    <w:p>
+      <w:pPr>
+        <w:spacing w:after="60"/>
+      </w:pPr>
+      <w:r>
+        <w:rPr>
+          <w:rFonts w:ascii="Aptos" w:hAnsi="Aptos"/>
+          <w:b/>
+          <w:i w:val="0"/>
+          <w:color w:val="C66A54"/>
+          <w:sz w:val="16"/>
+        </w:rPr>
+        <w:t>HUMBER GROUP GUIDE</w:t>
+      </w:r>
+    </w:p>
+    <w:p>
+      <w:pPr>
+        <w:pStyle w:val="Heading1"/>
+        <w:keepNext/>
+        <w:spacing w:before="60" w:after="120"/>
+      </w:pPr>
+      <w:r>
+        <w:rPr>
+          <w:rFonts w:ascii="Georgia" w:hAnsi="Georgia"/>
+          <w:b/>
+          <w:i w:val="0"/>
+          <w:color w:val="24333F"/>
+          <w:sz w:val="44"/>
+        </w:rPr>
+        <w:t>Team staging prefixes</w:t>
+      </w:r>
+    </w:p>
+    <w:p>
+      <w:pPr>
+        <w:spacing w:after="100" w:line="259" w:lineRule="auto"/>
+      </w:pPr>
+      <w:r>
+        <w:rPr>
+          <w:rFonts w:ascii="Aptos" w:hAnsi="Aptos"/>
+          <w:b w:val="0"/>
+          <w:i w:val="0"/>
+          <w:color w:val="24333F"/>
+          <w:sz w:val="20"/>
+        </w:rPr>
+        <w:t>Use these role prefixes and folders for incoming work. After import, use the Unreal asset prefix from the previous page.</w:t>
+      </w:r>
+    </w:p>
+    <w:tbl>
+      <w:tblPr>
+        <w:tblStyle w:val="TableGrid"/>
+        <w:tblW w:type="auto" w:w="0"/>
+        <w:jc w:val="center"/>
+        <w:tblLayout w:type="fixed"/>
+        <w:tblLook w:firstColumn="1" w:firstRow="1" w:lastColumn="0" w:lastRow="0" w:noHBand="0" w:noVBand="1" w:val="04A0"/>
+      </w:tblPr>
+      <w:tblGrid>
+        <w:gridCol w:w="3389"/>
+        <w:gridCol w:w="3389"/>
+        <w:gridCol w:w="3389"/>
+      </w:tblGrid>
+      <w:tr>
+        <w:trPr>
+          <w:tblHeader w:val="true"/>
+        </w:trPr>
+        <w:tc>
+          <w:tcPr>
+            <w:tcW w:type="dxa" w:w="3672"/>
+            <w:vAlign w:val="center"/>
+            <w:tcMar>
+              <w:top w:w="90" w:type="dxa"/>
+              <w:start w:w="110" w:type="dxa"/>
+              <w:bottom w:w="90" w:type="dxa"/>
+              <w:end w:w="110" w:type="dxa"/>
+            </w:tcMar>
+            <w:shd w:fill="24333F"/>
+          </w:tcPr>
+          <w:p>
+            <w:pPr>
+              <w:spacing w:after="0" w:line="252" w:lineRule="auto"/>
+            </w:pPr>
+            <w:r>
+              <w:rPr>
+                <w:rFonts w:ascii="Aptos" w:hAnsi="Aptos"/>
+                <w:b/>
+                <w:color w:val="FFFFFF"/>
+                <w:sz w:val="16"/>
+              </w:rPr>
+            </w:r>
+            <w:r>
+              <w:rPr>
+                <w:rFonts w:ascii="Aptos" w:hAnsi="Aptos"/>
+                <w:b/>
+                <w:color w:val="FFFFFF"/>
+                <w:sz w:val="16"/>
+              </w:rPr>
+              <w:t>Team role</w:t>
+            </w:r>
+          </w:p>
+        </w:tc>
+        <w:tc>
+          <w:tcPr>
+            <w:tcW w:type="dxa" w:w="4536"/>
+            <w:vAlign w:val="center"/>
+            <w:tcMar>
+              <w:top w:w="90" w:type="dxa"/>
+              <w:start w:w="110" w:type="dxa"/>
+              <w:bottom w:w="90" w:type="dxa"/>
+              <w:end w:w="110" w:type="dxa"/>
+            </w:tcMar>
+            <w:shd w:fill="24333F"/>
+          </w:tcPr>
+          <w:p>
+            <w:pPr>
+              <w:spacing w:after="0" w:line="252" w:lineRule="auto"/>
+            </w:pPr>
+            <w:r>
+              <w:rPr>
+                <w:rFonts w:ascii="Aptos" w:hAnsi="Aptos"/>
+                <w:b/>
+                <w:color w:val="FFFFFF"/>
+                <w:sz w:val="16"/>
+              </w:rPr>
+            </w:r>
+            <w:r>
+              <w:rPr>
+                <w:rFonts w:ascii="Aptos" w:hAnsi="Aptos"/>
+                <w:b/>
+                <w:color w:val="FFFFFF"/>
+                <w:sz w:val="16"/>
+              </w:rPr>
+              <w:t>Staging folder</w:t>
+            </w:r>
+          </w:p>
+        </w:tc>
+        <w:tc>
+          <w:tcPr>
+            <w:tcW w:type="dxa" w:w="1656"/>
+            <w:vAlign w:val="center"/>
+            <w:tcMar>
+              <w:top w:w="90" w:type="dxa"/>
+              <w:start w:w="110" w:type="dxa"/>
+              <w:bottom w:w="90" w:type="dxa"/>
+              <w:end w:w="110" w:type="dxa"/>
+            </w:tcMar>
+            <w:shd w:fill="24333F"/>
+          </w:tcPr>
+          <w:p>
+            <w:pPr>
+              <w:spacing w:after="0" w:line="252" w:lineRule="auto"/>
+            </w:pPr>
+            <w:r>
+              <w:rPr>
+                <w:rFonts w:ascii="Aptos" w:hAnsi="Aptos"/>
+                <w:b/>
+                <w:color w:val="FFFFFF"/>
+                <w:sz w:val="16"/>
+              </w:rPr>
+            </w:r>
+            <w:r>
+              <w:rPr>
+                <w:rFonts w:ascii="Aptos" w:hAnsi="Aptos"/>
+                <w:b/>
+                <w:color w:val="FFFFFF"/>
+                <w:sz w:val="16"/>
+              </w:rPr>
+              <w:t>Prefix</w:t>
+            </w:r>
+          </w:p>
+        </w:tc>
+      </w:tr>
+      <w:tr>
+        <w:tc>
+          <w:tcPr>
+            <w:tcW w:type="dxa" w:w="3672"/>
+            <w:vAlign w:val="center"/>
+            <w:tcMar>
+              <w:top w:w="90" w:type="dxa"/>
+              <w:start w:w="110" w:type="dxa"/>
+              <w:bottom w:w="90" w:type="dxa"/>
+              <w:end w:w="110" w:type="dxa"/>
+            </w:tcMar>
+          </w:tcPr>
+          <w:p>
+            <w:pPr>
+              <w:spacing w:after="0" w:line="250" w:lineRule="auto"/>
+            </w:pPr>
+            <w:r>
+              <w:rPr>
+                <w:rFonts w:ascii="Aptos" w:hAnsi="Aptos"/>
+                <w:color w:val="24333F"/>
+                <w:sz w:val="16"/>
+              </w:rPr>
+            </w:r>
+            <w:r>
+              <w:rPr>
+                <w:rFonts w:ascii="Aptos" w:hAnsi="Aptos"/>
+                <w:b w:val="0"/>
+                <w:color w:val="24333F"/>
+                <w:sz w:val="16"/>
+              </w:rPr>
+              <w:t>1. Director, script and beats</w:t>
+            </w:r>
+          </w:p>
+        </w:tc>
+        <w:tc>
+          <w:tcPr>
+            <w:tcW w:type="dxa" w:w="4536"/>
+            <w:vAlign w:val="center"/>
+            <w:tcMar>
+              <w:top w:w="90" w:type="dxa"/>
+              <w:start w:w="110" w:type="dxa"/>
+              <w:bottom w:w="90" w:type="dxa"/>
+              <w:end w:w="110" w:type="dxa"/>
+            </w:tcMar>
+          </w:tcPr>
+          <w:p>
+            <w:pPr>
+              <w:spacing w:after="0" w:line="250" w:lineRule="auto"/>
+            </w:pPr>
+            <w:r>
+              <w:rPr>
+                <w:rFonts w:ascii="Aptos" w:hAnsi="Aptos"/>
+                <w:color w:val="24333F"/>
+                <w:sz w:val="16"/>
+              </w:rPr>
+            </w:r>
+            <w:r>
+              <w:rPr>
+                <w:rFonts w:ascii="Aptos" w:hAnsi="Aptos"/>
+                <w:b w:val="0"/>
+                <w:color w:val="24333F"/>
+                <w:sz w:val="16"/>
+              </w:rPr>
+              <w:t>01_Preprod/Story/</w:t>
+            </w:r>
+          </w:p>
+        </w:tc>
+        <w:tc>
+          <w:tcPr>
+            <w:tcW w:type="dxa" w:w="1656"/>
+            <w:vAlign w:val="center"/>
+            <w:tcMar>
+              <w:top w:w="90" w:type="dxa"/>
+              <w:start w:w="110" w:type="dxa"/>
+              <w:bottom w:w="90" w:type="dxa"/>
+              <w:end w:w="110" w:type="dxa"/>
+            </w:tcMar>
+          </w:tcPr>
+          <w:p>
+            <w:pPr>
+              <w:spacing w:after="0" w:line="250" w:lineRule="auto"/>
+            </w:pPr>
+            <w:r>
+              <w:rPr>
+                <w:rFonts w:ascii="Aptos" w:hAnsi="Aptos"/>
+                <w:color w:val="24333F"/>
+                <w:sz w:val="16"/>
+              </w:rPr>
+            </w:r>
+            <w:r>
+              <w:rPr>
+                <w:rFonts w:ascii="Aptos" w:hAnsi="Aptos"/>
+                <w:b w:val="0"/>
+                <w:color w:val="24333F"/>
+                <w:sz w:val="16"/>
+              </w:rPr>
+              <w:t>DOC_ / STORY_ / BEAT_</w:t>
+            </w:r>
+          </w:p>
+        </w:tc>
+      </w:tr>
+      <w:tr>
+        <w:tc>
+          <w:tcPr>
+            <w:tcW w:type="dxa" w:w="3672"/>
+            <w:vAlign w:val="center"/>
+            <w:tcMar>
+              <w:top w:w="90" w:type="dxa"/>
+              <w:start w:w="110" w:type="dxa"/>
+              <w:bottom w:w="90" w:type="dxa"/>
+              <w:end w:w="110" w:type="dxa"/>
+            </w:tcMar>
+            <w:shd w:fill="F0F4F2"/>
+          </w:tcPr>
+          <w:p>
+            <w:pPr>
+              <w:spacing w:after="0" w:line="250" w:lineRule="auto"/>
+            </w:pPr>
+            <w:r>
+              <w:rPr>
+                <w:rFonts w:ascii="Aptos" w:hAnsi="Aptos"/>
+                <w:color w:val="24333F"/>
+                <w:sz w:val="16"/>
+              </w:rPr>
+            </w:r>
+            <w:r>
+              <w:rPr>
+                <w:rFonts w:ascii="Aptos" w:hAnsi="Aptos"/>
+                <w:b w:val="0"/>
+                <w:color w:val="24333F"/>
+                <w:sz w:val="16"/>
+              </w:rPr>
+              <w:t>2. Storyboard and animatic</w:t>
+            </w:r>
+          </w:p>
+        </w:tc>
+        <w:tc>
+          <w:tcPr>
+            <w:tcW w:type="dxa" w:w="4536"/>
+            <w:vAlign w:val="center"/>
+            <w:tcMar>
+              <w:top w:w="90" w:type="dxa"/>
+              <w:start w:w="110" w:type="dxa"/>
+              <w:bottom w:w="90" w:type="dxa"/>
+              <w:end w:w="110" w:type="dxa"/>
+            </w:tcMar>
+            <w:shd w:fill="F0F4F2"/>
+          </w:tcPr>
+          <w:p>
+            <w:pPr>
+              <w:spacing w:after="0" w:line="250" w:lineRule="auto"/>
+            </w:pPr>
+            <w:r>
+              <w:rPr>
+                <w:rFonts w:ascii="Aptos" w:hAnsi="Aptos"/>
+                <w:color w:val="24333F"/>
+                <w:sz w:val="16"/>
+              </w:rPr>
+            </w:r>
+            <w:r>
+              <w:rPr>
+                <w:rFonts w:ascii="Aptos" w:hAnsi="Aptos"/>
+                <w:b w:val="0"/>
+                <w:color w:val="24333F"/>
+                <w:sz w:val="16"/>
+              </w:rPr>
+              <w:t>01_Preprod/Storyboard/</w:t>
+            </w:r>
+          </w:p>
+        </w:tc>
+        <w:tc>
+          <w:tcPr>
+            <w:tcW w:type="dxa" w:w="1656"/>
+            <w:vAlign w:val="center"/>
+            <w:tcMar>
+              <w:top w:w="90" w:type="dxa"/>
+              <w:start w:w="110" w:type="dxa"/>
+              <w:bottom w:w="90" w:type="dxa"/>
+              <w:end w:w="110" w:type="dxa"/>
+            </w:tcMar>
+            <w:shd w:fill="F0F4F2"/>
+          </w:tcPr>
+          <w:p>
+            <w:pPr>
+              <w:spacing w:after="0" w:line="250" w:lineRule="auto"/>
+            </w:pPr>
+            <w:r>
+              <w:rPr>
+                <w:rFonts w:ascii="Aptos" w:hAnsi="Aptos"/>
+                <w:color w:val="24333F"/>
+                <w:sz w:val="16"/>
+              </w:rPr>
+            </w:r>
+            <w:r>
+              <w:rPr>
+                <w:rFonts w:ascii="Aptos" w:hAnsi="Aptos"/>
+                <w:b w:val="0"/>
+                <w:color w:val="24333F"/>
+                <w:sz w:val="16"/>
+              </w:rPr>
+              <w:t>SB_ / PNL_</w:t>
+            </w:r>
+          </w:p>
+        </w:tc>
+      </w:tr>
+      <w:tr>
+        <w:tc>
+          <w:tcPr>
+            <w:tcW w:type="dxa" w:w="3672"/>
+            <w:vAlign w:val="center"/>
+            <w:tcMar>
+              <w:top w:w="90" w:type="dxa"/>
+              <w:start w:w="110" w:type="dxa"/>
+              <w:bottom w:w="90" w:type="dxa"/>
+              <w:end w:w="110" w:type="dxa"/>
+            </w:tcMar>
+          </w:tcPr>
+          <w:p>
+            <w:pPr>
+              <w:spacing w:after="0" w:line="250" w:lineRule="auto"/>
+            </w:pPr>
+            <w:r>
+              <w:rPr>
+                <w:rFonts w:ascii="Aptos" w:hAnsi="Aptos"/>
+                <w:color w:val="24333F"/>
+                <w:sz w:val="16"/>
+              </w:rPr>
+            </w:r>
+            <w:r>
+              <w:rPr>
+                <w:rFonts w:ascii="Aptos" w:hAnsi="Aptos"/>
+                <w:b w:val="0"/>
+                <w:color w:val="24333F"/>
+                <w:sz w:val="16"/>
+              </w:rPr>
+              <w:t>3. Concept art and references</w:t>
+            </w:r>
+          </w:p>
+        </w:tc>
+        <w:tc>
+          <w:tcPr>
+            <w:tcW w:type="dxa" w:w="4536"/>
+            <w:vAlign w:val="center"/>
+            <w:tcMar>
+              <w:top w:w="90" w:type="dxa"/>
+              <w:start w:w="110" w:type="dxa"/>
+              <w:bottom w:w="90" w:type="dxa"/>
+              <w:end w:w="110" w:type="dxa"/>
+            </w:tcMar>
+          </w:tcPr>
+          <w:p>
+            <w:pPr>
+              <w:spacing w:after="0" w:line="250" w:lineRule="auto"/>
+            </w:pPr>
+            <w:r>
+              <w:rPr>
+                <w:rFonts w:ascii="Aptos" w:hAnsi="Aptos"/>
+                <w:color w:val="24333F"/>
+                <w:sz w:val="16"/>
+              </w:rPr>
+            </w:r>
+            <w:r>
+              <w:rPr>
+                <w:rFonts w:ascii="Aptos" w:hAnsi="Aptos"/>
+                <w:b w:val="0"/>
+                <w:color w:val="24333F"/>
+                <w:sz w:val="16"/>
+              </w:rPr>
+              <w:t>01_Preprod/References/</w:t>
+            </w:r>
+          </w:p>
+        </w:tc>
+        <w:tc>
+          <w:tcPr>
+            <w:tcW w:type="dxa" w:w="1656"/>
+            <w:vAlign w:val="center"/>
+            <w:tcMar>
+              <w:top w:w="90" w:type="dxa"/>
+              <w:start w:w="110" w:type="dxa"/>
+              <w:bottom w:w="90" w:type="dxa"/>
+              <w:end w:w="110" w:type="dxa"/>
+            </w:tcMar>
+          </w:tcPr>
+          <w:p>
+            <w:pPr>
+              <w:spacing w:after="0" w:line="250" w:lineRule="auto"/>
+            </w:pPr>
+            <w:r>
+              <w:rPr>
+                <w:rFonts w:ascii="Aptos" w:hAnsi="Aptos"/>
+                <w:color w:val="24333F"/>
+                <w:sz w:val="16"/>
+              </w:rPr>
+            </w:r>
+            <w:r>
+              <w:rPr>
+                <w:rFonts w:ascii="Aptos" w:hAnsi="Aptos"/>
+                <w:b w:val="0"/>
+                <w:color w:val="24333F"/>
+                <w:sz w:val="16"/>
+              </w:rPr>
+              <w:t>REF_ / CON_</w:t>
+            </w:r>
+          </w:p>
+        </w:tc>
+      </w:tr>
+      <w:tr>
+        <w:tc>
+          <w:tcPr>
+            <w:tcW w:type="dxa" w:w="3672"/>
+            <w:vAlign w:val="center"/>
+            <w:tcMar>
+              <w:top w:w="90" w:type="dxa"/>
+              <w:start w:w="110" w:type="dxa"/>
+              <w:bottom w:w="90" w:type="dxa"/>
+              <w:end w:w="110" w:type="dxa"/>
+            </w:tcMar>
+            <w:shd w:fill="F0F4F2"/>
+          </w:tcPr>
+          <w:p>
+            <w:pPr>
+              <w:spacing w:after="0" w:line="250" w:lineRule="auto"/>
+            </w:pPr>
+            <w:r>
+              <w:rPr>
+                <w:rFonts w:ascii="Aptos" w:hAnsi="Aptos"/>
+                <w:color w:val="24333F"/>
+                <w:sz w:val="16"/>
+              </w:rPr>
+            </w:r>
+            <w:r>
+              <w:rPr>
+                <w:rFonts w:ascii="Aptos" w:hAnsi="Aptos"/>
+                <w:b w:val="0"/>
+                <w:color w:val="24333F"/>
+                <w:sz w:val="16"/>
+              </w:rPr>
+              <w:t>4. Character model</w:t>
+            </w:r>
+          </w:p>
+        </w:tc>
+        <w:tc>
+          <w:tcPr>
+            <w:tcW w:type="dxa" w:w="4536"/>
+            <w:vAlign w:val="center"/>
+            <w:tcMar>
+              <w:top w:w="90" w:type="dxa"/>
+              <w:start w:w="110" w:type="dxa"/>
+              <w:bottom w:w="90" w:type="dxa"/>
+              <w:end w:w="110" w:type="dxa"/>
+            </w:tcMar>
+            <w:shd w:fill="F0F4F2"/>
+          </w:tcPr>
+          <w:p>
+            <w:pPr>
+              <w:spacing w:after="0" w:line="250" w:lineRule="auto"/>
+            </w:pPr>
+            <w:r>
+              <w:rPr>
+                <w:rFonts w:ascii="Aptos" w:hAnsi="Aptos"/>
+                <w:color w:val="24333F"/>
+                <w:sz w:val="16"/>
+              </w:rPr>
+            </w:r>
+            <w:r>
+              <w:rPr>
+                <w:rFonts w:ascii="Aptos" w:hAnsi="Aptos"/>
+                <w:b w:val="0"/>
+                <w:color w:val="24333F"/>
+                <w:sz w:val="16"/>
+              </w:rPr>
+              <w:t>02_Assets/Models/Characters/</w:t>
+            </w:r>
+          </w:p>
+        </w:tc>
+        <w:tc>
+          <w:tcPr>
+            <w:tcW w:type="dxa" w:w="1656"/>
+            <w:vAlign w:val="center"/>
+            <w:tcMar>
+              <w:top w:w="90" w:type="dxa"/>
+              <w:start w:w="110" w:type="dxa"/>
+              <w:bottom w:w="90" w:type="dxa"/>
+              <w:end w:w="110" w:type="dxa"/>
+            </w:tcMar>
+            <w:shd w:fill="F0F4F2"/>
+          </w:tcPr>
+          <w:p>
+            <w:pPr>
+              <w:spacing w:after="0" w:line="250" w:lineRule="auto"/>
+            </w:pPr>
+            <w:r>
+              <w:rPr>
+                <w:rFonts w:ascii="Aptos" w:hAnsi="Aptos"/>
+                <w:color w:val="24333F"/>
+                <w:sz w:val="16"/>
+              </w:rPr>
+            </w:r>
+            <w:r>
+              <w:rPr>
+                <w:rFonts w:ascii="Aptos" w:hAnsi="Aptos"/>
+                <w:b w:val="0"/>
+                <w:color w:val="24333F"/>
+                <w:sz w:val="16"/>
+              </w:rPr>
+              <w:t>CH_</w:t>
+            </w:r>
+          </w:p>
+        </w:tc>
+      </w:tr>
+      <w:tr>
+        <w:tc>
+          <w:tcPr>
+            <w:tcW w:type="dxa" w:w="3672"/>
+            <w:vAlign w:val="center"/>
+            <w:tcMar>
+              <w:top w:w="90" w:type="dxa"/>
+              <w:start w:w="110" w:type="dxa"/>
+              <w:bottom w:w="90" w:type="dxa"/>
+              <w:end w:w="110" w:type="dxa"/>
+            </w:tcMar>
+          </w:tcPr>
+          <w:p>
+            <w:pPr>
+              <w:spacing w:after="0" w:line="250" w:lineRule="auto"/>
+            </w:pPr>
+            <w:r>
+              <w:rPr>
+                <w:rFonts w:ascii="Aptos" w:hAnsi="Aptos"/>
+                <w:color w:val="24333F"/>
+                <w:sz w:val="16"/>
+              </w:rPr>
+            </w:r>
+            <w:r>
+              <w:rPr>
+                <w:rFonts w:ascii="Aptos" w:hAnsi="Aptos"/>
+                <w:b w:val="0"/>
+                <w:color w:val="24333F"/>
+                <w:sz w:val="16"/>
+              </w:rPr>
+              <w:t>5. Environment and architecture</w:t>
+            </w:r>
+          </w:p>
+        </w:tc>
+        <w:tc>
+          <w:tcPr>
+            <w:tcW w:type="dxa" w:w="4536"/>
+            <w:vAlign w:val="center"/>
+            <w:tcMar>
+              <w:top w:w="90" w:type="dxa"/>
+              <w:start w:w="110" w:type="dxa"/>
+              <w:bottom w:w="90" w:type="dxa"/>
+              <w:end w:w="110" w:type="dxa"/>
+            </w:tcMar>
+          </w:tcPr>
+          <w:p>
+            <w:pPr>
+              <w:spacing w:after="0" w:line="250" w:lineRule="auto"/>
+            </w:pPr>
+            <w:r>
+              <w:rPr>
+                <w:rFonts w:ascii="Aptos" w:hAnsi="Aptos"/>
+                <w:color w:val="24333F"/>
+                <w:sz w:val="16"/>
+              </w:rPr>
+            </w:r>
+            <w:r>
+              <w:rPr>
+                <w:rFonts w:ascii="Aptos" w:hAnsi="Aptos"/>
+                <w:b w:val="0"/>
+                <w:color w:val="24333F"/>
+                <w:sz w:val="16"/>
+              </w:rPr>
+              <w:t>02_Assets/Models/Environments/</w:t>
+            </w:r>
+          </w:p>
+        </w:tc>
+        <w:tc>
+          <w:tcPr>
+            <w:tcW w:type="dxa" w:w="1656"/>
+            <w:vAlign w:val="center"/>
+            <w:tcMar>
+              <w:top w:w="90" w:type="dxa"/>
+              <w:start w:w="110" w:type="dxa"/>
+              <w:bottom w:w="90" w:type="dxa"/>
+              <w:end w:w="110" w:type="dxa"/>
+            </w:tcMar>
+          </w:tcPr>
+          <w:p>
+            <w:pPr>
+              <w:spacing w:after="0" w:line="250" w:lineRule="auto"/>
+            </w:pPr>
+            <w:r>
+              <w:rPr>
+                <w:rFonts w:ascii="Aptos" w:hAnsi="Aptos"/>
+                <w:color w:val="24333F"/>
+                <w:sz w:val="16"/>
+              </w:rPr>
+            </w:r>
+            <w:r>
+              <w:rPr>
+                <w:rFonts w:ascii="Aptos" w:hAnsi="Aptos"/>
+                <w:b w:val="0"/>
+                <w:color w:val="24333F"/>
+                <w:sz w:val="16"/>
+              </w:rPr>
+              <w:t>EN_</w:t>
+            </w:r>
+          </w:p>
+        </w:tc>
+      </w:tr>
+      <w:tr>
+        <w:tc>
+          <w:tcPr>
+            <w:tcW w:type="dxa" w:w="3672"/>
+            <w:vAlign w:val="center"/>
+            <w:tcMar>
+              <w:top w:w="90" w:type="dxa"/>
+              <w:start w:w="110" w:type="dxa"/>
+              <w:bottom w:w="90" w:type="dxa"/>
+              <w:end w:w="110" w:type="dxa"/>
+            </w:tcMar>
+            <w:shd w:fill="F0F4F2"/>
+          </w:tcPr>
+          <w:p>
+            <w:pPr>
+              <w:spacing w:after="0" w:line="250" w:lineRule="auto"/>
+            </w:pPr>
+            <w:r>
+              <w:rPr>
+                <w:rFonts w:ascii="Aptos" w:hAnsi="Aptos"/>
+                <w:color w:val="24333F"/>
+                <w:sz w:val="16"/>
+              </w:rPr>
+            </w:r>
+            <w:r>
+              <w:rPr>
+                <w:rFonts w:ascii="Aptos" w:hAnsi="Aptos"/>
+                <w:b w:val="0"/>
+                <w:color w:val="24333F"/>
+                <w:sz w:val="16"/>
+              </w:rPr>
+              <w:t>6. Props</w:t>
+            </w:r>
+          </w:p>
+        </w:tc>
+        <w:tc>
+          <w:tcPr>
+            <w:tcW w:type="dxa" w:w="4536"/>
+            <w:vAlign w:val="center"/>
+            <w:tcMar>
+              <w:top w:w="90" w:type="dxa"/>
+              <w:start w:w="110" w:type="dxa"/>
+              <w:bottom w:w="90" w:type="dxa"/>
+              <w:end w:w="110" w:type="dxa"/>
+            </w:tcMar>
+            <w:shd w:fill="F0F4F2"/>
+          </w:tcPr>
+          <w:p>
+            <w:pPr>
+              <w:spacing w:after="0" w:line="250" w:lineRule="auto"/>
+            </w:pPr>
+            <w:r>
+              <w:rPr>
+                <w:rFonts w:ascii="Aptos" w:hAnsi="Aptos"/>
+                <w:color w:val="24333F"/>
+                <w:sz w:val="16"/>
+              </w:rPr>
+            </w:r>
+            <w:r>
+              <w:rPr>
+                <w:rFonts w:ascii="Aptos" w:hAnsi="Aptos"/>
+                <w:b w:val="0"/>
+                <w:color w:val="24333F"/>
+                <w:sz w:val="16"/>
+              </w:rPr>
+              <w:t>02_Assets/Models/Props/</w:t>
+            </w:r>
+          </w:p>
+        </w:tc>
+        <w:tc>
+          <w:tcPr>
+            <w:tcW w:type="dxa" w:w="1656"/>
+            <w:vAlign w:val="center"/>
+            <w:tcMar>
+              <w:top w:w="90" w:type="dxa"/>
+              <w:start w:w="110" w:type="dxa"/>
+              <w:bottom w:w="90" w:type="dxa"/>
+              <w:end w:w="110" w:type="dxa"/>
+            </w:tcMar>
+            <w:shd w:fill="F0F4F2"/>
+          </w:tcPr>
+          <w:p>
+            <w:pPr>
+              <w:spacing w:after="0" w:line="250" w:lineRule="auto"/>
+            </w:pPr>
+            <w:r>
+              <w:rPr>
+                <w:rFonts w:ascii="Aptos" w:hAnsi="Aptos"/>
+                <w:color w:val="24333F"/>
+                <w:sz w:val="16"/>
+              </w:rPr>
+            </w:r>
+            <w:r>
+              <w:rPr>
+                <w:rFonts w:ascii="Aptos" w:hAnsi="Aptos"/>
+                <w:b w:val="0"/>
+                <w:color w:val="24333F"/>
+                <w:sz w:val="16"/>
+              </w:rPr>
+              <w:t>PR_</w:t>
+            </w:r>
+          </w:p>
+        </w:tc>
+      </w:tr>
+      <w:tr>
+        <w:tc>
+          <w:tcPr>
+            <w:tcW w:type="dxa" w:w="3672"/>
+            <w:vAlign w:val="center"/>
+            <w:tcMar>
+              <w:top w:w="90" w:type="dxa"/>
+              <w:start w:w="110" w:type="dxa"/>
+              <w:bottom w:w="90" w:type="dxa"/>
+              <w:end w:w="110" w:type="dxa"/>
+            </w:tcMar>
+          </w:tcPr>
+          <w:p>
+            <w:pPr>
+              <w:spacing w:after="0" w:line="250" w:lineRule="auto"/>
+            </w:pPr>
+            <w:r>
+              <w:rPr>
+                <w:rFonts w:ascii="Aptos" w:hAnsi="Aptos"/>
+                <w:color w:val="24333F"/>
+                <w:sz w:val="16"/>
+              </w:rPr>
+            </w:r>
+            <w:r>
+              <w:rPr>
+                <w:rFonts w:ascii="Aptos" w:hAnsi="Aptos"/>
+                <w:b w:val="0"/>
+                <w:color w:val="24333F"/>
+                <w:sz w:val="16"/>
+              </w:rPr>
+              <w:t>7. Character body and face rig</w:t>
+            </w:r>
+          </w:p>
+        </w:tc>
+        <w:tc>
+          <w:tcPr>
+            <w:tcW w:type="dxa" w:w="4536"/>
+            <w:vAlign w:val="center"/>
+            <w:tcMar>
+              <w:top w:w="90" w:type="dxa"/>
+              <w:start w:w="110" w:type="dxa"/>
+              <w:bottom w:w="90" w:type="dxa"/>
+              <w:end w:w="110" w:type="dxa"/>
+            </w:tcMar>
+          </w:tcPr>
+          <w:p>
+            <w:pPr>
+              <w:spacing w:after="0" w:line="250" w:lineRule="auto"/>
+            </w:pPr>
+            <w:r>
+              <w:rPr>
+                <w:rFonts w:ascii="Aptos" w:hAnsi="Aptos"/>
+                <w:color w:val="24333F"/>
+                <w:sz w:val="16"/>
+              </w:rPr>
+            </w:r>
+            <w:r>
+              <w:rPr>
+                <w:rFonts w:ascii="Aptos" w:hAnsi="Aptos"/>
+                <w:b w:val="0"/>
+                <w:color w:val="24333F"/>
+                <w:sz w:val="16"/>
+              </w:rPr>
+              <w:t>02_Assets/Rigs/Character/</w:t>
+            </w:r>
+          </w:p>
+        </w:tc>
+        <w:tc>
+          <w:tcPr>
+            <w:tcW w:type="dxa" w:w="1656"/>
+            <w:vAlign w:val="center"/>
+            <w:tcMar>
+              <w:top w:w="90" w:type="dxa"/>
+              <w:start w:w="110" w:type="dxa"/>
+              <w:bottom w:w="90" w:type="dxa"/>
+              <w:end w:w="110" w:type="dxa"/>
+            </w:tcMar>
+          </w:tcPr>
+          <w:p>
+            <w:pPr>
+              <w:spacing w:after="0" w:line="250" w:lineRule="auto"/>
+            </w:pPr>
+            <w:r>
+              <w:rPr>
+                <w:rFonts w:ascii="Aptos" w:hAnsi="Aptos"/>
+                <w:color w:val="24333F"/>
+                <w:sz w:val="16"/>
+              </w:rPr>
+            </w:r>
+            <w:r>
+              <w:rPr>
+                <w:rFonts w:ascii="Aptos" w:hAnsi="Aptos"/>
+                <w:b w:val="0"/>
+                <w:color w:val="24333F"/>
+                <w:sz w:val="16"/>
+              </w:rPr>
+              <w:t>RIG_CH_</w:t>
+            </w:r>
+          </w:p>
+        </w:tc>
+      </w:tr>
+      <w:tr>
+        <w:tc>
+          <w:tcPr>
+            <w:tcW w:type="dxa" w:w="3672"/>
+            <w:vAlign w:val="center"/>
+            <w:tcMar>
+              <w:top w:w="90" w:type="dxa"/>
+              <w:start w:w="110" w:type="dxa"/>
+              <w:bottom w:w="90" w:type="dxa"/>
+              <w:end w:w="110" w:type="dxa"/>
+            </w:tcMar>
+            <w:shd w:fill="F0F4F2"/>
+          </w:tcPr>
+          <w:p>
+            <w:pPr>
+              <w:spacing w:after="0" w:line="250" w:lineRule="auto"/>
+            </w:pPr>
+            <w:r>
+              <w:rPr>
+                <w:rFonts w:ascii="Aptos" w:hAnsi="Aptos"/>
+                <w:color w:val="24333F"/>
+                <w:sz w:val="16"/>
+              </w:rPr>
+            </w:r>
+            <w:r>
+              <w:rPr>
+                <w:rFonts w:ascii="Aptos" w:hAnsi="Aptos"/>
+                <w:b w:val="0"/>
+                <w:color w:val="24333F"/>
+                <w:sz w:val="16"/>
+              </w:rPr>
+              <w:t>8. Prop and mechanical rig</w:t>
+            </w:r>
+          </w:p>
+        </w:tc>
+        <w:tc>
+          <w:tcPr>
+            <w:tcW w:type="dxa" w:w="4536"/>
+            <w:vAlign w:val="center"/>
+            <w:tcMar>
+              <w:top w:w="90" w:type="dxa"/>
+              <w:start w:w="110" w:type="dxa"/>
+              <w:bottom w:w="90" w:type="dxa"/>
+              <w:end w:w="110" w:type="dxa"/>
+            </w:tcMar>
+            <w:shd w:fill="F0F4F2"/>
+          </w:tcPr>
+          <w:p>
+            <w:pPr>
+              <w:spacing w:after="0" w:line="250" w:lineRule="auto"/>
+            </w:pPr>
+            <w:r>
+              <w:rPr>
+                <w:rFonts w:ascii="Aptos" w:hAnsi="Aptos"/>
+                <w:color w:val="24333F"/>
+                <w:sz w:val="16"/>
+              </w:rPr>
+            </w:r>
+            <w:r>
+              <w:rPr>
+                <w:rFonts w:ascii="Aptos" w:hAnsi="Aptos"/>
+                <w:b w:val="0"/>
+                <w:color w:val="24333F"/>
+                <w:sz w:val="16"/>
+              </w:rPr>
+              <w:t>02_Assets/Rigs/Props/</w:t>
+            </w:r>
+          </w:p>
+        </w:tc>
+        <w:tc>
+          <w:tcPr>
+            <w:tcW w:type="dxa" w:w="1656"/>
+            <w:vAlign w:val="center"/>
+            <w:tcMar>
+              <w:top w:w="90" w:type="dxa"/>
+              <w:start w:w="110" w:type="dxa"/>
+              <w:bottom w:w="90" w:type="dxa"/>
+              <w:end w:w="110" w:type="dxa"/>
+            </w:tcMar>
+            <w:shd w:fill="F0F4F2"/>
+          </w:tcPr>
+          <w:p>
+            <w:pPr>
+              <w:spacing w:after="0" w:line="250" w:lineRule="auto"/>
+            </w:pPr>
+            <w:r>
+              <w:rPr>
+                <w:rFonts w:ascii="Aptos" w:hAnsi="Aptos"/>
+                <w:color w:val="24333F"/>
+                <w:sz w:val="16"/>
+              </w:rPr>
+            </w:r>
+            <w:r>
+              <w:rPr>
+                <w:rFonts w:ascii="Aptos" w:hAnsi="Aptos"/>
+                <w:b w:val="0"/>
+                <w:color w:val="24333F"/>
+                <w:sz w:val="16"/>
+              </w:rPr>
+              <w:t>RIG_PR_</w:t>
+            </w:r>
+          </w:p>
+        </w:tc>
+      </w:tr>
+      <w:tr>
+        <w:tc>
+          <w:tcPr>
+            <w:tcW w:type="dxa" w:w="3672"/>
+            <w:vAlign w:val="center"/>
+            <w:tcMar>
+              <w:top w:w="90" w:type="dxa"/>
+              <w:start w:w="110" w:type="dxa"/>
+              <w:bottom w:w="90" w:type="dxa"/>
+              <w:end w:w="110" w:type="dxa"/>
+            </w:tcMar>
+          </w:tcPr>
+          <w:p>
+            <w:pPr>
+              <w:spacing w:after="0" w:line="250" w:lineRule="auto"/>
+            </w:pPr>
+            <w:r>
+              <w:rPr>
+                <w:rFonts w:ascii="Aptos" w:hAnsi="Aptos"/>
+                <w:color w:val="24333F"/>
+                <w:sz w:val="16"/>
+              </w:rPr>
+            </w:r>
+            <w:r>
+              <w:rPr>
+                <w:rFonts w:ascii="Aptos" w:hAnsi="Aptos"/>
+                <w:b w:val="0"/>
+                <w:color w:val="24333F"/>
+                <w:sz w:val="16"/>
+              </w:rPr>
+              <w:t>9. Toon shader and surfacing</w:t>
+            </w:r>
+          </w:p>
+        </w:tc>
+        <w:tc>
+          <w:tcPr>
+            <w:tcW w:type="dxa" w:w="4536"/>
+            <w:vAlign w:val="center"/>
+            <w:tcMar>
+              <w:top w:w="90" w:type="dxa"/>
+              <w:start w:w="110" w:type="dxa"/>
+              <w:bottom w:w="90" w:type="dxa"/>
+              <w:end w:w="110" w:type="dxa"/>
+            </w:tcMar>
+          </w:tcPr>
+          <w:p>
+            <w:pPr>
+              <w:spacing w:after="0" w:line="250" w:lineRule="auto"/>
+            </w:pPr>
+            <w:r>
+              <w:rPr>
+                <w:rFonts w:ascii="Aptos" w:hAnsi="Aptos"/>
+                <w:color w:val="24333F"/>
+                <w:sz w:val="16"/>
+              </w:rPr>
+            </w:r>
+            <w:r>
+              <w:rPr>
+                <w:rFonts w:ascii="Aptos" w:hAnsi="Aptos"/>
+                <w:b w:val="0"/>
+                <w:color w:val="24333F"/>
+                <w:sz w:val="16"/>
+              </w:rPr>
+              <w:t>02_Assets/Materials/</w:t>
+            </w:r>
+          </w:p>
+        </w:tc>
+        <w:tc>
+          <w:tcPr>
+            <w:tcW w:type="dxa" w:w="1656"/>
+            <w:vAlign w:val="center"/>
+            <w:tcMar>
+              <w:top w:w="90" w:type="dxa"/>
+              <w:start w:w="110" w:type="dxa"/>
+              <w:bottom w:w="90" w:type="dxa"/>
+              <w:end w:w="110" w:type="dxa"/>
+            </w:tcMar>
+          </w:tcPr>
+          <w:p>
+            <w:pPr>
+              <w:spacing w:after="0" w:line="250" w:lineRule="auto"/>
+            </w:pPr>
+            <w:r>
+              <w:rPr>
+                <w:rFonts w:ascii="Aptos" w:hAnsi="Aptos"/>
+                <w:color w:val="24333F"/>
+                <w:sz w:val="16"/>
+              </w:rPr>
+            </w:r>
+            <w:r>
+              <w:rPr>
+                <w:rFonts w:ascii="Aptos" w:hAnsi="Aptos"/>
+                <w:b w:val="0"/>
+                <w:color w:val="24333F"/>
+                <w:sz w:val="16"/>
+              </w:rPr>
+              <w:t>M_ / MI_ / TP_ / T_</w:t>
+            </w:r>
+          </w:p>
+        </w:tc>
+      </w:tr>
+      <w:tr>
+        <w:tc>
+          <w:tcPr>
+            <w:tcW w:type="dxa" w:w="3672"/>
+            <w:vAlign w:val="center"/>
+            <w:tcMar>
+              <w:top w:w="90" w:type="dxa"/>
+              <w:start w:w="110" w:type="dxa"/>
+              <w:bottom w:w="90" w:type="dxa"/>
+              <w:end w:w="110" w:type="dxa"/>
+            </w:tcMar>
+            <w:shd w:fill="F0F4F2"/>
+          </w:tcPr>
+          <w:p>
+            <w:pPr>
+              <w:spacing w:after="0" w:line="250" w:lineRule="auto"/>
+            </w:pPr>
+            <w:r>
+              <w:rPr>
+                <w:rFonts w:ascii="Aptos" w:hAnsi="Aptos"/>
+                <w:color w:val="24333F"/>
+                <w:sz w:val="16"/>
+              </w:rPr>
+            </w:r>
+            <w:r>
+              <w:rPr>
+                <w:rFonts w:ascii="Aptos" w:hAnsi="Aptos"/>
+                <w:b w:val="0"/>
+                <w:color w:val="24333F"/>
+                <w:sz w:val="16"/>
+              </w:rPr>
+              <w:t>10. Character acting animation</w:t>
+            </w:r>
+          </w:p>
+        </w:tc>
+        <w:tc>
+          <w:tcPr>
+            <w:tcW w:type="dxa" w:w="4536"/>
+            <w:vAlign w:val="center"/>
+            <w:tcMar>
+              <w:top w:w="90" w:type="dxa"/>
+              <w:start w:w="110" w:type="dxa"/>
+              <w:bottom w:w="90" w:type="dxa"/>
+              <w:end w:w="110" w:type="dxa"/>
+            </w:tcMar>
+            <w:shd w:fill="F0F4F2"/>
+          </w:tcPr>
+          <w:p>
+            <w:pPr>
+              <w:spacing w:after="0" w:line="250" w:lineRule="auto"/>
+            </w:pPr>
+            <w:r>
+              <w:rPr>
+                <w:rFonts w:ascii="Aptos" w:hAnsi="Aptos"/>
+                <w:color w:val="24333F"/>
+                <w:sz w:val="16"/>
+              </w:rPr>
+            </w:r>
+            <w:r>
+              <w:rPr>
+                <w:rFonts w:ascii="Aptos" w:hAnsi="Aptos"/>
+                <w:b w:val="0"/>
+                <w:color w:val="24333F"/>
+                <w:sz w:val="16"/>
+              </w:rPr>
+              <w:t>03_Scenes/Animation/Acting/</w:t>
+            </w:r>
+          </w:p>
+        </w:tc>
+        <w:tc>
+          <w:tcPr>
+            <w:tcW w:type="dxa" w:w="1656"/>
+            <w:vAlign w:val="center"/>
+            <w:tcMar>
+              <w:top w:w="90" w:type="dxa"/>
+              <w:start w:w="110" w:type="dxa"/>
+              <w:bottom w:w="90" w:type="dxa"/>
+              <w:end w:w="110" w:type="dxa"/>
+            </w:tcMar>
+            <w:shd w:fill="F0F4F2"/>
+          </w:tcPr>
+          <w:p>
+            <w:pPr>
+              <w:spacing w:after="0" w:line="250" w:lineRule="auto"/>
+            </w:pPr>
+            <w:r>
+              <w:rPr>
+                <w:rFonts w:ascii="Aptos" w:hAnsi="Aptos"/>
+                <w:color w:val="24333F"/>
+                <w:sz w:val="16"/>
+              </w:rPr>
+            </w:r>
+            <w:r>
+              <w:rPr>
+                <w:rFonts w:ascii="Aptos" w:hAnsi="Aptos"/>
+                <w:b w:val="0"/>
+                <w:color w:val="24333F"/>
+                <w:sz w:val="16"/>
+              </w:rPr>
+              <w:t>SC_ACT_</w:t>
+            </w:r>
+          </w:p>
+        </w:tc>
+      </w:tr>
+      <w:tr>
+        <w:tc>
+          <w:tcPr>
+            <w:tcW w:type="dxa" w:w="3672"/>
+            <w:vAlign w:val="center"/>
+            <w:tcMar>
+              <w:top w:w="90" w:type="dxa"/>
+              <w:start w:w="110" w:type="dxa"/>
+              <w:bottom w:w="90" w:type="dxa"/>
+              <w:end w:w="110" w:type="dxa"/>
+            </w:tcMar>
+          </w:tcPr>
+          <w:p>
+            <w:pPr>
+              <w:spacing w:after="0" w:line="250" w:lineRule="auto"/>
+            </w:pPr>
+            <w:r>
+              <w:rPr>
+                <w:rFonts w:ascii="Aptos" w:hAnsi="Aptos"/>
+                <w:color w:val="24333F"/>
+                <w:sz w:val="16"/>
+              </w:rPr>
+            </w:r>
+            <w:r>
+              <w:rPr>
+                <w:rFonts w:ascii="Aptos" w:hAnsi="Aptos"/>
+                <w:b w:val="0"/>
+                <w:color w:val="24333F"/>
+                <w:sz w:val="16"/>
+              </w:rPr>
+              <w:t>11. Action and camera layout</w:t>
+            </w:r>
+          </w:p>
+        </w:tc>
+        <w:tc>
+          <w:tcPr>
+            <w:tcW w:type="dxa" w:w="4536"/>
+            <w:vAlign w:val="center"/>
+            <w:tcMar>
+              <w:top w:w="90" w:type="dxa"/>
+              <w:start w:w="110" w:type="dxa"/>
+              <w:bottom w:w="90" w:type="dxa"/>
+              <w:end w:w="110" w:type="dxa"/>
+            </w:tcMar>
+          </w:tcPr>
+          <w:p>
+            <w:pPr>
+              <w:spacing w:after="0" w:line="250" w:lineRule="auto"/>
+            </w:pPr>
+            <w:r>
+              <w:rPr>
+                <w:rFonts w:ascii="Aptos" w:hAnsi="Aptos"/>
+                <w:color w:val="24333F"/>
+                <w:sz w:val="16"/>
+              </w:rPr>
+            </w:r>
+            <w:r>
+              <w:rPr>
+                <w:rFonts w:ascii="Aptos" w:hAnsi="Aptos"/>
+                <w:b w:val="0"/>
+                <w:color w:val="24333F"/>
+                <w:sz w:val="16"/>
+              </w:rPr>
+              <w:t>03_Scenes/Animation/Action/</w:t>
+            </w:r>
+          </w:p>
+        </w:tc>
+        <w:tc>
+          <w:tcPr>
+            <w:tcW w:type="dxa" w:w="1656"/>
+            <w:vAlign w:val="center"/>
+            <w:tcMar>
+              <w:top w:w="90" w:type="dxa"/>
+              <w:start w:w="110" w:type="dxa"/>
+              <w:bottom w:w="90" w:type="dxa"/>
+              <w:end w:w="110" w:type="dxa"/>
+            </w:tcMar>
+          </w:tcPr>
+          <w:p>
+            <w:pPr>
+              <w:spacing w:after="0" w:line="250" w:lineRule="auto"/>
+            </w:pPr>
+            <w:r>
+              <w:rPr>
+                <w:rFonts w:ascii="Aptos" w:hAnsi="Aptos"/>
+                <w:color w:val="24333F"/>
+                <w:sz w:val="16"/>
+              </w:rPr>
+            </w:r>
+            <w:r>
+              <w:rPr>
+                <w:rFonts w:ascii="Aptos" w:hAnsi="Aptos"/>
+                <w:b w:val="0"/>
+                <w:color w:val="24333F"/>
+                <w:sz w:val="16"/>
+              </w:rPr>
+              <w:t>SC_ACTN_</w:t>
+            </w:r>
+          </w:p>
+        </w:tc>
+      </w:tr>
+      <w:tr>
+        <w:tc>
+          <w:tcPr>
+            <w:tcW w:type="dxa" w:w="3672"/>
+            <w:vAlign w:val="center"/>
+            <w:tcMar>
+              <w:top w:w="90" w:type="dxa"/>
+              <w:start w:w="110" w:type="dxa"/>
+              <w:bottom w:w="90" w:type="dxa"/>
+              <w:end w:w="110" w:type="dxa"/>
+            </w:tcMar>
+            <w:shd w:fill="F0F4F2"/>
+          </w:tcPr>
+          <w:p>
+            <w:pPr>
+              <w:spacing w:after="0" w:line="250" w:lineRule="auto"/>
+            </w:pPr>
+            <w:r>
+              <w:rPr>
+                <w:rFonts w:ascii="Aptos" w:hAnsi="Aptos"/>
+                <w:color w:val="24333F"/>
+                <w:sz w:val="16"/>
+              </w:rPr>
+            </w:r>
+            <w:r>
+              <w:rPr>
+                <w:rFonts w:ascii="Aptos" w:hAnsi="Aptos"/>
+                <w:b w:val="0"/>
+                <w:color w:val="24333F"/>
+                <w:sz w:val="16"/>
+              </w:rPr>
+              <w:t>12. Lighting and look development</w:t>
+            </w:r>
+          </w:p>
+        </w:tc>
+        <w:tc>
+          <w:tcPr>
+            <w:tcW w:type="dxa" w:w="4536"/>
+            <w:vAlign w:val="center"/>
+            <w:tcMar>
+              <w:top w:w="90" w:type="dxa"/>
+              <w:start w:w="110" w:type="dxa"/>
+              <w:bottom w:w="90" w:type="dxa"/>
+              <w:end w:w="110" w:type="dxa"/>
+            </w:tcMar>
+            <w:shd w:fill="F0F4F2"/>
+          </w:tcPr>
+          <w:p>
+            <w:pPr>
+              <w:spacing w:after="0" w:line="250" w:lineRule="auto"/>
+            </w:pPr>
+            <w:r>
+              <w:rPr>
+                <w:rFonts w:ascii="Aptos" w:hAnsi="Aptos"/>
+                <w:color w:val="24333F"/>
+                <w:sz w:val="16"/>
+              </w:rPr>
+            </w:r>
+            <w:r>
+              <w:rPr>
+                <w:rFonts w:ascii="Aptos" w:hAnsi="Aptos"/>
+                <w:b w:val="0"/>
+                <w:color w:val="24333F"/>
+                <w:sz w:val="16"/>
+              </w:rPr>
+              <w:t>03_Scenes/Lighting/</w:t>
+            </w:r>
+          </w:p>
+        </w:tc>
+        <w:tc>
+          <w:tcPr>
+            <w:tcW w:type="dxa" w:w="1656"/>
+            <w:vAlign w:val="center"/>
+            <w:tcMar>
+              <w:top w:w="90" w:type="dxa"/>
+              <w:start w:w="110" w:type="dxa"/>
+              <w:bottom w:w="90" w:type="dxa"/>
+              <w:end w:w="110" w:type="dxa"/>
+            </w:tcMar>
+            <w:shd w:fill="F0F4F2"/>
+          </w:tcPr>
+          <w:p>
+            <w:pPr>
+              <w:spacing w:after="0" w:line="250" w:lineRule="auto"/>
+            </w:pPr>
+            <w:r>
+              <w:rPr>
+                <w:rFonts w:ascii="Aptos" w:hAnsi="Aptos"/>
+                <w:color w:val="24333F"/>
+                <w:sz w:val="16"/>
+              </w:rPr>
+            </w:r>
+            <w:r>
+              <w:rPr>
+                <w:rFonts w:ascii="Aptos" w:hAnsi="Aptos"/>
+                <w:b w:val="0"/>
+                <w:color w:val="24333F"/>
+                <w:sz w:val="16"/>
+              </w:rPr>
+              <w:t>LGT_</w:t>
+            </w:r>
+          </w:p>
+        </w:tc>
+      </w:tr>
+      <w:tr>
+        <w:tc>
+          <w:tcPr>
+            <w:tcW w:type="dxa" w:w="3672"/>
+            <w:vAlign w:val="center"/>
+            <w:tcMar>
+              <w:top w:w="90" w:type="dxa"/>
+              <w:start w:w="110" w:type="dxa"/>
+              <w:bottom w:w="90" w:type="dxa"/>
+              <w:end w:w="110" w:type="dxa"/>
+            </w:tcMar>
+          </w:tcPr>
+          <w:p>
+            <w:pPr>
+              <w:spacing w:after="0" w:line="250" w:lineRule="auto"/>
+            </w:pPr>
+            <w:r>
+              <w:rPr>
+                <w:rFonts w:ascii="Aptos" w:hAnsi="Aptos"/>
+                <w:color w:val="24333F"/>
+                <w:sz w:val="16"/>
+              </w:rPr>
+            </w:r>
+            <w:r>
+              <w:rPr>
+                <w:rFonts w:ascii="Aptos" w:hAnsi="Aptos"/>
+                <w:b w:val="0"/>
+                <w:color w:val="24333F"/>
+                <w:sz w:val="16"/>
+              </w:rPr>
+              <w:t>13. VFX and compositing</w:t>
+            </w:r>
+          </w:p>
+        </w:tc>
+        <w:tc>
+          <w:tcPr>
+            <w:tcW w:type="dxa" w:w="4536"/>
+            <w:vAlign w:val="center"/>
+            <w:tcMar>
+              <w:top w:w="90" w:type="dxa"/>
+              <w:start w:w="110" w:type="dxa"/>
+              <w:bottom w:w="90" w:type="dxa"/>
+              <w:end w:w="110" w:type="dxa"/>
+            </w:tcMar>
+          </w:tcPr>
+          <w:p>
+            <w:pPr>
+              <w:spacing w:after="0" w:line="250" w:lineRule="auto"/>
+            </w:pPr>
+            <w:r>
+              <w:rPr>
+                <w:rFonts w:ascii="Aptos" w:hAnsi="Aptos"/>
+                <w:color w:val="24333F"/>
+                <w:sz w:val="16"/>
+              </w:rPr>
+            </w:r>
+            <w:r>
+              <w:rPr>
+                <w:rFonts w:ascii="Aptos" w:hAnsi="Aptos"/>
+                <w:b w:val="0"/>
+                <w:color w:val="24333F"/>
+                <w:sz w:val="16"/>
+              </w:rPr>
+              <w:t>04_Renders/Compositing/</w:t>
+            </w:r>
+          </w:p>
+        </w:tc>
+        <w:tc>
+          <w:tcPr>
+            <w:tcW w:type="dxa" w:w="1656"/>
+            <w:vAlign w:val="center"/>
+            <w:tcMar>
+              <w:top w:w="90" w:type="dxa"/>
+              <w:start w:w="110" w:type="dxa"/>
+              <w:bottom w:w="90" w:type="dxa"/>
+              <w:end w:w="110" w:type="dxa"/>
+            </w:tcMar>
+          </w:tcPr>
+          <w:p>
+            <w:pPr>
+              <w:spacing w:after="0" w:line="250" w:lineRule="auto"/>
+            </w:pPr>
+            <w:r>
+              <w:rPr>
+                <w:rFonts w:ascii="Aptos" w:hAnsi="Aptos"/>
+                <w:color w:val="24333F"/>
+                <w:sz w:val="16"/>
+              </w:rPr>
+            </w:r>
+            <w:r>
+              <w:rPr>
+                <w:rFonts w:ascii="Aptos" w:hAnsi="Aptos"/>
+                <w:b w:val="0"/>
+                <w:color w:val="24333F"/>
+                <w:sz w:val="16"/>
+              </w:rPr>
+              <w:t>FX_ / COMP_</w:t>
+            </w:r>
+          </w:p>
+        </w:tc>
+      </w:tr>
+      <w:tr>
+        <w:tc>
+          <w:tcPr>
+            <w:tcW w:type="dxa" w:w="3672"/>
+            <w:vAlign w:val="center"/>
+            <w:tcMar>
+              <w:top w:w="90" w:type="dxa"/>
+              <w:start w:w="110" w:type="dxa"/>
+              <w:bottom w:w="90" w:type="dxa"/>
+              <w:end w:w="110" w:type="dxa"/>
+            </w:tcMar>
+            <w:shd w:fill="F0F4F2"/>
+          </w:tcPr>
+          <w:p>
+            <w:pPr>
+              <w:spacing w:after="0" w:line="250" w:lineRule="auto"/>
+            </w:pPr>
+            <w:r>
+              <w:rPr>
+                <w:rFonts w:ascii="Aptos" w:hAnsi="Aptos"/>
+                <w:color w:val="24333F"/>
+                <w:sz w:val="16"/>
+              </w:rPr>
+            </w:r>
+            <w:r>
+              <w:rPr>
+                <w:rFonts w:ascii="Aptos" w:hAnsi="Aptos"/>
+                <w:b w:val="0"/>
+                <w:color w:val="24333F"/>
+                <w:sz w:val="16"/>
+              </w:rPr>
+              <w:t>14. Editing and soundtrack</w:t>
+            </w:r>
+          </w:p>
+        </w:tc>
+        <w:tc>
+          <w:tcPr>
+            <w:tcW w:type="dxa" w:w="4536"/>
+            <w:vAlign w:val="center"/>
+            <w:tcMar>
+              <w:top w:w="90" w:type="dxa"/>
+              <w:start w:w="110" w:type="dxa"/>
+              <w:bottom w:w="90" w:type="dxa"/>
+              <w:end w:w="110" w:type="dxa"/>
+            </w:tcMar>
+            <w:shd w:fill="F0F4F2"/>
+          </w:tcPr>
+          <w:p>
+            <w:pPr>
+              <w:spacing w:after="0" w:line="250" w:lineRule="auto"/>
+            </w:pPr>
+            <w:r>
+              <w:rPr>
+                <w:rFonts w:ascii="Aptos" w:hAnsi="Aptos"/>
+                <w:color w:val="24333F"/>
+                <w:sz w:val="16"/>
+              </w:rPr>
+            </w:r>
+            <w:r>
+              <w:rPr>
+                <w:rFonts w:ascii="Aptos" w:hAnsi="Aptos"/>
+                <w:b w:val="0"/>
+                <w:color w:val="24333F"/>
+                <w:sz w:val="16"/>
+              </w:rPr>
+              <w:t>05_Edit/Sequences/</w:t>
+            </w:r>
+          </w:p>
+        </w:tc>
+        <w:tc>
+          <w:tcPr>
+            <w:tcW w:type="dxa" w:w="1656"/>
+            <w:vAlign w:val="center"/>
+            <w:tcMar>
+              <w:top w:w="90" w:type="dxa"/>
+              <w:start w:w="110" w:type="dxa"/>
+              <w:bottom w:w="90" w:type="dxa"/>
+              <w:end w:w="110" w:type="dxa"/>
+            </w:tcMar>
+            <w:shd w:fill="F0F4F2"/>
+          </w:tcPr>
+          <w:p>
+            <w:pPr>
+              <w:spacing w:after="0" w:line="250" w:lineRule="auto"/>
+            </w:pPr>
+            <w:r>
+              <w:rPr>
+                <w:rFonts w:ascii="Aptos" w:hAnsi="Aptos"/>
+                <w:color w:val="24333F"/>
+                <w:sz w:val="16"/>
+              </w:rPr>
+            </w:r>
+            <w:r>
+              <w:rPr>
+                <w:rFonts w:ascii="Aptos" w:hAnsi="Aptos"/>
+                <w:b w:val="0"/>
+                <w:color w:val="24333F"/>
+                <w:sz w:val="16"/>
+              </w:rPr>
+              <w:t>ED_ / VSE_ / AUD_</w:t>
+            </w:r>
+          </w:p>
+        </w:tc>
+      </w:tr>
+    </w:tbl>
+    <w:p>
+      <w:pPr>
+        <w:spacing w:after="0"/>
+      </w:pPr>
+    </w:p>
+    <w:tbl>
+      <w:tblPr>
+        <w:tblW w:type="auto" w:w="0"/>
+        <w:jc w:val="center"/>
+        <w:tblLook w:firstColumn="1" w:firstRow="1" w:lastColumn="0" w:lastRow="0" w:noHBand="0" w:noVBand="1" w:val="04A0"/>
+      </w:tblPr>
+      <w:tblGrid>
+        <w:gridCol w:w="10166"/>
+      </w:tblGrid>
+      <w:tr>
+        <w:tc>
+          <w:tcPr>
+            <w:tcW w:type="dxa" w:w="10166"/>
+            <w:shd w:fill="E8EFED"/>
+            <w:tcMar>
+              <w:top w:w="150" w:type="dxa"/>
+              <w:start w:w="190" w:type="dxa"/>
+              <w:bottom w:w="150" w:type="dxa"/>
+              <w:end w:w="190" w:type="dxa"/>
+            </w:tcMar>
+          </w:tcPr>
+          <w:p>
+            <w:pPr>
+              <w:spacing w:after="60"/>
+            </w:pPr>
+            <w:r/>
+            <w:r>
+              <w:rPr>
+                <w:rFonts w:ascii="Aptos" w:hAnsi="Aptos"/>
+                <w:b/>
+                <w:i w:val="0"/>
+                <w:color w:val="287F83"/>
+                <w:sz w:val="20"/>
+              </w:rPr>
+              <w:t>Version source drops</w:t>
+            </w:r>
+          </w:p>
+          <w:p>
+            <w:pPr>
+              <w:spacing w:after="0" w:line="252" w:lineRule="auto"/>
+            </w:pPr>
+            <w:r>
+              <w:rPr>
+                <w:rFonts w:ascii="Aptos" w:hAnsi="Aptos"/>
+                <w:b w:val="0"/>
+                <w:i w:val="0"/>
+                <w:color w:val="24333F"/>
+                <w:sz w:val="19"/>
+              </w:rPr>
+              <w:t>The Humber guide uses _v01 for the first version and asks for no spaces in staged names. Use a new version suffix for a revised source drop. Keep imported Unreal asset names stable after other assets reference them.</w:t>
+            </w:r>
+          </w:p>
+        </w:tc>
+      </w:tr>
+    </w:tbl>
+    <w:p>
+      <w:pPr>
+        <w:spacing w:after="0"/>
+      </w:pPr>
+    </w:p>
+    <w:p>
+      <w:pPr>
+        <w:spacing w:after="0" w:line="259" w:lineRule="auto"/>
+      </w:pPr>
+      <w:r>
+        <w:rPr>
+          <w:rFonts w:ascii="Aptos" w:hAnsi="Aptos"/>
+          <w:b w:val="0"/>
+          <w:i w:val="0"/>
+          <w:color w:val="61707A"/>
+          <w:sz w:val="17"/>
+        </w:rPr>
+        <w:t>Naming source: Unreal prefixes follow Docs/CONTENT_CONVENTIONS.md. Role prefixes and staging folders follow GROUP_STAGING_GUIDE.md. The Canva link supplied for this task returned a 404.</w:t>
+      </w:r>
     </w:p>
     <w:p>
       <w:r>
@@ -4791,7 +6029,7 @@
                 <w:color w:val="24333F"/>
                 <w:sz w:val="17"/>
               </w:rPr>
-              <w:t>The source FBX body has no skin cluster, so this export cannot prove body deformation.</w:t>
+              <w:t>The body has no skin cluster in this FBX and cannot deform as exported.</w:t>
             </w:r>
           </w:p>
         </w:tc>
@@ -5528,7 +6766,7 @@
                 <w:color w:val="24333F"/>
                 <w:sz w:val="17"/>
               </w:rPr>
-              <w:t>Interior pieces are staged. Character and spider rig binds remain a dependency.</w:t>
+              <w:t>Interior pieces are staged. Character and spider rigs still need their final binds.</w:t>
             </w:r>
           </w:p>
         </w:tc>
@@ -6128,7 +7366,7 @@
                 <w:color w:val="24333F"/>
                 <w:sz w:val="16"/>
               </w:rPr>
-              <w:t>Judge final Substrate materials on the SM6 workstation. One Oct 13 render-queue attempt reported a stale image.</w:t>
+              <w:t>Judge final Substrate materials on the SM6 workstation. The Oct 13 render queue returned a stale image once.</w:t>
             </w:r>
           </w:p>
         </w:tc>

</xml_diff>